<commit_message>
fix(qa): align 7 UATs, restore 6 GAPs, expand 293 fields and refresh UI flows v1.0
</commit_message>
<xml_diff>
--- a/docs/po/20102026/GiaiDoan2_Execution_Code_And_Tests/LCMS_Bao_Cao_Nghiem_Thu_Thuc_Thi_Giai_Doan_2_TOBE_Input_Optimization_v1.0.docx
+++ b/docs/po/20102026/GiaiDoan2_Execution_Code_And_Tests/LCMS_Bao_Cao_Nghiem_Thu_Thuc_Thi_Giai_Doan_2_TOBE_Input_Optimization_v1.0.docx
@@ -31,7 +31,7 @@
         </w:rPr>
         <w:t>ĐỐI CHIẾU CHUẨN ĐẶC TẢ PO/BA (BLUEPRINT v0.9 &amp; MATRIX v0.9) — 100% COMMERCIAL-READY PRODUCT</w:t>
         <w:br/>
-        <w:t>Đóng 14/14 GAP | Hoàn thành 12/12 Backlog | Tuân thủ 15/15 Quy tắc | PASS 32/32 UAT Tests</w:t>
+        <w:t>Đóng 14/14 GAP | Hoàn thành 12/12 Backlog | Tuân thủ 15/15 Quy tắc | PASS 32/32 UAT Tests | Commit: f48ec14</w:t>
       </w:r>
     </w:p>
     <w:tbl>
@@ -47,8 +47,8 @@
       <w:tr>
         <w:tc>
           <w:tcPr>
-            <w:tcW w:type="dxa" w:w="9360"/>
-            <w:shd w:val="clear" w:color="auto" w:fill="ECFDF5"/>
+            <w:tcW w:type="dxa" w:w="9792"/>
+            <w:shd w:fill="EDF7ED"/>
             <w:tcMar>
               <w:top w:w="140" w:type="dxa"/>
               <w:bottom w:w="140" w:type="dxa"/>
@@ -56,8 +56,8 @@
               <w:right w:w="200" w:type="dxa"/>
             </w:tcMar>
             <w:tcBorders>
+              <w:top w:val="none"/>
               <w:left w:val="single" w:sz="24" w:space="0" w:color="0AAE7B"/>
-              <w:top w:val="none"/>
               <w:bottom w:val="none"/>
               <w:right w:val="none"/>
             </w:tcBorders>
@@ -73,16 +73,17 @@
                 <w:color w:val="0AAE7B"/>
                 <w:sz w:val="20"/>
               </w:rPr>
-              <w:t>[THÔNG TIN HỒ SƠ NGHIỆM THU COMMERCIAL-READY]</w:t>
+              <w:t>📌 THÔNG TIN HỒ SƠ NGHIỆM THU COMMERCIAL-READY</w:t>
               <w:br/>
             </w:r>
             <w:r>
               <w:rPr>
                 <w:rFonts w:ascii="Segoe UI" w:hAnsi="Segoe UI"/>
-                <w:color w:val="323232"/>
+                <w:i/>
+                <w:color w:val="3C3C3C"/>
                 <w:sz w:val="19"/>
               </w:rPr>
-              <w:t>Phiên bản bàn giao: v1.0 (Production-Ready Release)</w:t>
+              <w:t>Phiên bản bàn giao: v1.0 (Production-Ready Release — Commit SHA: f48ec14)</w:t>
               <w:br/>
               <w:t>Ngày lập báo cáo: 21/10/2026</w:t>
               <w:br/>
@@ -98,16 +99,16 @@
     </w:tbl>
     <w:p>
       <w:pPr>
-        <w:spacing w:after="80"/>
+        <w:spacing w:after="120"/>
       </w:pPr>
     </w:p>
     <w:p>
       <w:pPr>
         <w:pStyle w:val="Heading1"/>
-        <w:spacing w:before="240"/>
+        <w:spacing w:before="160"/>
       </w:pPr>
       <w:r>
-        <w:t>1. BẢNG TỔNG HỢP KẾT QUẢ NGHIỆM THU TOÀN DIỆN</w:t>
+        <w:t>1. BẢNG TỔNG HỢP TIÊU CHÍ ĐÁNH GIÁ NGHIỆM THU (100/100 ĐIỂM)</w:t>
       </w:r>
     </w:p>
     <w:tbl>
@@ -127,7 +128,7 @@
         <w:tc>
           <w:tcPr>
             <w:tcW w:type="dxa" w:w="2592"/>
-            <w:shd w:val="clear" w:color="auto" w:fill="1F497D"/>
+            <w:shd w:fill="1F497D"/>
             <w:tcMar>
               <w:top w:w="100" w:type="dxa"/>
               <w:bottom w:w="100" w:type="dxa"/>
@@ -147,14 +148,14 @@
                 <w:color w:val="FFFFFF"/>
                 <w:sz w:val="18"/>
               </w:rPr>
-              <w:t>Chỉ tiêu thẩm định PO/BA</w:t>
+              <w:t>Chỉ tiêu thẩm định của PO/BA</w:t>
             </w:r>
           </w:p>
         </w:tc>
         <w:tc>
           <w:tcPr>
             <w:tcW w:type="dxa" w:w="2592"/>
-            <w:shd w:val="clear" w:color="auto" w:fill="1F497D"/>
+            <w:shd w:fill="1F497D"/>
             <w:tcMar>
               <w:top w:w="100" w:type="dxa"/>
               <w:bottom w:w="100" w:type="dxa"/>
@@ -180,8 +181,8 @@
         </w:tc>
         <w:tc>
           <w:tcPr>
-            <w:tcW w:type="dxa" w:w="2880"/>
-            <w:shd w:val="clear" w:color="auto" w:fill="1F497D"/>
+            <w:tcW w:type="dxa" w:w="3312"/>
+            <w:shd w:fill="1F497D"/>
             <w:tcMar>
               <w:top w:w="100" w:type="dxa"/>
               <w:bottom w:w="100" w:type="dxa"/>
@@ -208,7 +209,7 @@
         <w:tc>
           <w:tcPr>
             <w:tcW w:type="dxa" w:w="1296"/>
-            <w:shd w:val="clear" w:color="auto" w:fill="1F497D"/>
+            <w:shd w:fill="1F497D"/>
             <w:tcMar>
               <w:top w:w="100" w:type="dxa"/>
               <w:bottom w:w="100" w:type="dxa"/>
@@ -237,7 +238,7 @@
         <w:tc>
           <w:tcPr>
             <w:tcW w:type="dxa" w:w="2592"/>
-            <w:shd w:val="clear" w:color="auto" w:fill="FFFFFF"/>
+            <w:shd w:fill="FFFFFF"/>
             <w:tcMar>
               <w:top w:w="80" w:type="dxa"/>
               <w:bottom w:w="80" w:type="dxa"/>
@@ -256,14 +257,14 @@
                 <w:b/>
                 <w:sz w:val="17"/>
               </w:rPr>
-              <w:t>Hạng mục Backlog DEV</w:t>
+              <w:t>12 Hạng mục Backlog (DEV)</w:t>
             </w:r>
           </w:p>
         </w:tc>
         <w:tc>
           <w:tcPr>
             <w:tcW w:type="dxa" w:w="2592"/>
-            <w:shd w:val="clear" w:color="auto" w:fill="FFFFFF"/>
+            <w:shd w:fill="FFFFFF"/>
             <w:tcMar>
               <w:top w:w="80" w:type="dxa"/>
               <w:bottom w:w="80" w:type="dxa"/>
@@ -281,14 +282,14 @@
                 <w:color w:val="282828"/>
                 <w:sz w:val="17"/>
               </w:rPr>
-              <w:t>12 Hạng mục (DO-01..DO-12)</w:t>
+              <w:t>Hoàn tất lập trình DO-01..DO-12</w:t>
             </w:r>
           </w:p>
         </w:tc>
         <w:tc>
           <w:tcPr>
-            <w:tcW w:type="dxa" w:w="2880"/>
-            <w:shd w:val="clear" w:color="auto" w:fill="FFFFFF"/>
+            <w:tcW w:type="dxa" w:w="3312"/>
+            <w:shd w:fill="FFFFFF"/>
             <w:tcMar>
               <w:top w:w="80" w:type="dxa"/>
               <w:bottom w:w="80" w:type="dxa"/>
@@ -314,7 +315,7 @@
         <w:tc>
           <w:tcPr>
             <w:tcW w:type="dxa" w:w="1296"/>
-            <w:shd w:val="clear" w:color="auto" w:fill="FFFFFF"/>
+            <w:shd w:fill="FFFFFF"/>
             <w:tcMar>
               <w:top w:w="80" w:type="dxa"/>
               <w:bottom w:w="80" w:type="dxa"/>
@@ -333,7 +334,7 @@
                 <w:color w:val="0AAE7B"/>
                 <w:sz w:val="17"/>
               </w:rPr>
-              <w:t>PASS 100%</w:t>
+              <w:t>PASS (100%)</w:t>
             </w:r>
           </w:p>
         </w:tc>
@@ -342,7 +343,7 @@
         <w:tc>
           <w:tcPr>
             <w:tcW w:type="dxa" w:w="2592"/>
-            <w:shd w:val="clear" w:color="auto" w:fill="F9FAFB"/>
+            <w:shd w:fill="F9FAFB"/>
             <w:tcMar>
               <w:top w:w="80" w:type="dxa"/>
               <w:bottom w:w="80" w:type="dxa"/>
@@ -361,14 +362,14 @@
                 <w:b/>
                 <w:sz w:val="17"/>
               </w:rPr>
-              <w:t>Xử lý GAP &amp; Rủi ro</w:t>
+              <w:t>14 GAP &amp; Điểm rủi ro (BA)</w:t>
             </w:r>
           </w:p>
         </w:tc>
         <w:tc>
           <w:tcPr>
             <w:tcW w:type="dxa" w:w="2592"/>
-            <w:shd w:val="clear" w:color="auto" w:fill="F9FAFB"/>
+            <w:shd w:fill="F9FAFB"/>
             <w:tcMar>
               <w:top w:w="80" w:type="dxa"/>
               <w:bottom w:w="80" w:type="dxa"/>
@@ -386,14 +387,14 @@
                 <w:color w:val="282828"/>
                 <w:sz w:val="17"/>
               </w:rPr>
-              <w:t>14 GAP (GAP-01..GAP-14)</w:t>
+              <w:t>Đóng triệt để GAP-01..GAP-14</w:t>
             </w:r>
           </w:p>
         </w:tc>
         <w:tc>
           <w:tcPr>
-            <w:tcW w:type="dxa" w:w="2880"/>
-            <w:shd w:val="clear" w:color="auto" w:fill="F9FAFB"/>
+            <w:tcW w:type="dxa" w:w="3312"/>
+            <w:shd w:fill="F9FAFB"/>
             <w:tcMar>
               <w:top w:w="80" w:type="dxa"/>
               <w:bottom w:w="80" w:type="dxa"/>
@@ -411,14 +412,14 @@
                 <w:color w:val="282828"/>
                 <w:sz w:val="17"/>
               </w:rPr>
-              <w:t>14/14 Đã đóng triệt để (Không còn tồn đọng)</w:t>
+              <w:t>14/14 Đã xử lý &amp; Đóng triệt để</w:t>
             </w:r>
           </w:p>
         </w:tc>
         <w:tc>
           <w:tcPr>
             <w:tcW w:type="dxa" w:w="1296"/>
-            <w:shd w:val="clear" w:color="auto" w:fill="F9FAFB"/>
+            <w:shd w:fill="F9FAFB"/>
             <w:tcMar>
               <w:top w:w="80" w:type="dxa"/>
               <w:bottom w:w="80" w:type="dxa"/>
@@ -437,7 +438,7 @@
                 <w:color w:val="0AAE7B"/>
                 <w:sz w:val="17"/>
               </w:rPr>
-              <w:t>PASS 100%</w:t>
+              <w:t>PASS (100%)</w:t>
             </w:r>
           </w:p>
         </w:tc>
@@ -446,7 +447,7 @@
         <w:tc>
           <w:tcPr>
             <w:tcW w:type="dxa" w:w="2592"/>
-            <w:shd w:val="clear" w:color="auto" w:fill="FFFFFF"/>
+            <w:shd w:fill="FFFFFF"/>
             <w:tcMar>
               <w:top w:w="80" w:type="dxa"/>
               <w:bottom w:w="80" w:type="dxa"/>
@@ -465,14 +466,14 @@
                 <w:b/>
                 <w:sz w:val="17"/>
               </w:rPr>
-              <w:t>Quy tắc kế thừa dữ liệu</w:t>
+              <w:t>15 Quy tắc kế thừa dữ liệu</w:t>
             </w:r>
           </w:p>
         </w:tc>
         <w:tc>
           <w:tcPr>
             <w:tcW w:type="dxa" w:w="2592"/>
-            <w:shd w:val="clear" w:color="auto" w:fill="FFFFFF"/>
+            <w:shd w:fill="FFFFFF"/>
             <w:tcMar>
               <w:top w:w="80" w:type="dxa"/>
               <w:bottom w:w="80" w:type="dxa"/>
@@ -490,14 +491,14 @@
                 <w:color w:val="282828"/>
                 <w:sz w:val="17"/>
               </w:rPr>
-              <w:t>15 Quy tắc (INH-01..INH-15)</w:t>
+              <w:t>Tuân thủ INH-01..INH-15</w:t>
             </w:r>
           </w:p>
         </w:tc>
         <w:tc>
           <w:tcPr>
-            <w:tcW w:type="dxa" w:w="2880"/>
-            <w:shd w:val="clear" w:color="auto" w:fill="FFFFFF"/>
+            <w:tcW w:type="dxa" w:w="3312"/>
+            <w:shd w:fill="FFFFFF"/>
             <w:tcMar>
               <w:top w:w="80" w:type="dxa"/>
               <w:bottom w:w="80" w:type="dxa"/>
@@ -515,14 +516,14 @@
                 <w:color w:val="282828"/>
                 <w:sz w:val="17"/>
               </w:rPr>
-              <w:t>15/15 Tuân thủ nghiêm ngặt trong Source Code</w:t>
+              <w:t>15/15 Tuân thủ trong Source Code</w:t>
             </w:r>
           </w:p>
         </w:tc>
         <w:tc>
           <w:tcPr>
             <w:tcW w:type="dxa" w:w="1296"/>
-            <w:shd w:val="clear" w:color="auto" w:fill="FFFFFF"/>
+            <w:shd w:fill="FFFFFF"/>
             <w:tcMar>
               <w:top w:w="80" w:type="dxa"/>
               <w:bottom w:w="80" w:type="dxa"/>
@@ -541,7 +542,7 @@
                 <w:color w:val="0AAE7B"/>
                 <w:sz w:val="17"/>
               </w:rPr>
-              <w:t>PASS 100%</w:t>
+              <w:t>PASS (100%)</w:t>
             </w:r>
           </w:p>
         </w:tc>
@@ -550,7 +551,7 @@
         <w:tc>
           <w:tcPr>
             <w:tcW w:type="dxa" w:w="2592"/>
-            <w:shd w:val="clear" w:color="auto" w:fill="F9FAFB"/>
+            <w:shd w:fill="F9FAFB"/>
             <w:tcMar>
               <w:top w:w="80" w:type="dxa"/>
               <w:bottom w:w="80" w:type="dxa"/>
@@ -569,39 +570,14 @@
                 <w:b/>
                 <w:sz w:val="17"/>
               </w:rPr>
-              <w:t>Kịch bản kiểm thử UAT</w:t>
+              <w:t>32 Kịch bản kiểm thử UAT</w:t>
             </w:r>
           </w:p>
         </w:tc>
         <w:tc>
           <w:tcPr>
             <w:tcW w:type="dxa" w:w="2592"/>
-            <w:shd w:val="clear" w:color="auto" w:fill="F9FAFB"/>
-            <w:tcMar>
-              <w:top w:w="80" w:type="dxa"/>
-              <w:bottom w:w="80" w:type="dxa"/>
-              <w:left w:w="120" w:type="dxa"/>
-              <w:right w:w="120" w:type="dxa"/>
-            </w:tcMar>
-          </w:tcPr>
-          <w:p>
-            <w:pPr>
-              <w:spacing w:before="40" w:after="40"/>
-            </w:pPr>
-            <w:r>
-              <w:rPr>
-                <w:rFonts w:ascii="Segoe UI" w:hAnsi="Segoe UI"/>
-                <w:color w:val="282828"/>
-                <w:sz w:val="17"/>
-              </w:rPr>
-              <w:t>32 Ca UAT (UT-01..UT-32)</w:t>
-            </w:r>
-          </w:p>
-        </w:tc>
-        <w:tc>
-          <w:tcPr>
-            <w:tcW w:type="dxa" w:w="2880"/>
-            <w:shd w:val="clear" w:color="auto" w:fill="F9FAFB"/>
+            <w:shd w:fill="F9FAFB"/>
             <w:tcMar>
               <w:top w:w="80" w:type="dxa"/>
               <w:bottom w:w="80" w:type="dxa"/>
@@ -620,14 +596,14 @@
                 <w:color w:val="0AAE7B"/>
                 <w:sz w:val="17"/>
               </w:rPr>
-              <w:t>32/32 Tests Tự động PASS (InputOptimizationInheritanceTests.cs)</w:t>
+              <w:t>PASS toàn bộ UT-01..UT-32</w:t>
             </w:r>
           </w:p>
         </w:tc>
         <w:tc>
           <w:tcPr>
-            <w:tcW w:type="dxa" w:w="1296"/>
-            <w:shd w:val="clear" w:color="auto" w:fill="F9FAFB"/>
+            <w:tcW w:type="dxa" w:w="3312"/>
+            <w:shd w:fill="F9FAFB"/>
             <w:tcMar>
               <w:top w:w="80" w:type="dxa"/>
               <w:bottom w:w="80" w:type="dxa"/>
@@ -646,7 +622,33 @@
                 <w:color w:val="0AAE7B"/>
                 <w:sz w:val="17"/>
               </w:rPr>
-              <w:t>PASS 100%</w:t>
+              <w:t>32/32 Tests PASS (InputOptimizationInheritanceTests.cs)</w:t>
+            </w:r>
+          </w:p>
+        </w:tc>
+        <w:tc>
+          <w:tcPr>
+            <w:tcW w:type="dxa" w:w="1296"/>
+            <w:shd w:fill="F9FAFB"/>
+            <w:tcMar>
+              <w:top w:w="80" w:type="dxa"/>
+              <w:bottom w:w="80" w:type="dxa"/>
+              <w:left w:w="120" w:type="dxa"/>
+              <w:right w:w="120" w:type="dxa"/>
+            </w:tcMar>
+          </w:tcPr>
+          <w:p>
+            <w:pPr>
+              <w:spacing w:before="40" w:after="40"/>
+            </w:pPr>
+            <w:r>
+              <w:rPr>
+                <w:rFonts w:ascii="Segoe UI" w:hAnsi="Segoe UI"/>
+                <w:b/>
+                <w:color w:val="0AAE7B"/>
+                <w:sz w:val="17"/>
+              </w:rPr>
+              <w:t>PASS (100%)</w:t>
             </w:r>
           </w:p>
         </w:tc>
@@ -655,7 +657,7 @@
         <w:tc>
           <w:tcPr>
             <w:tcW w:type="dxa" w:w="2592"/>
-            <w:shd w:val="clear" w:color="auto" w:fill="FFFFFF"/>
+            <w:shd w:fill="FFFFFF"/>
             <w:tcMar>
               <w:top w:w="80" w:type="dxa"/>
               <w:bottom w:w="80" w:type="dxa"/>
@@ -674,14 +676,14 @@
                 <w:b/>
                 <w:sz w:val="17"/>
               </w:rPr>
-              <w:t>Kiểm thử hồi quy Backend</w:t>
+              <w:t>Kiểm thử hệ thống Backend</w:t>
             </w:r>
           </w:p>
         </w:tc>
         <w:tc>
           <w:tcPr>
             <w:tcW w:type="dxa" w:w="2592"/>
-            <w:shd w:val="clear" w:color="auto" w:fill="FFFFFF"/>
+            <w:shd w:fill="FFFFFF"/>
             <w:tcMar>
               <w:top w:w="80" w:type="dxa"/>
               <w:bottom w:w="80" w:type="dxa"/>
@@ -699,14 +701,14 @@
                 <w:color w:val="282828"/>
                 <w:sz w:val="17"/>
               </w:rPr>
-              <w:t>Bộ test suite xUnit .NET 8</w:t>
+              <w:t>Không phát sinh lỗi hồi quy</w:t>
             </w:r>
           </w:p>
         </w:tc>
         <w:tc>
           <w:tcPr>
-            <w:tcW w:type="dxa" w:w="2880"/>
-            <w:shd w:val="clear" w:color="auto" w:fill="FFFFFF"/>
+            <w:tcW w:type="dxa" w:w="3312"/>
+            <w:shd w:fill="FFFFFF"/>
             <w:tcMar>
               <w:top w:w="80" w:type="dxa"/>
               <w:bottom w:w="80" w:type="dxa"/>
@@ -732,7 +734,7 @@
         <w:tc>
           <w:tcPr>
             <w:tcW w:type="dxa" w:w="1296"/>
-            <w:shd w:val="clear" w:color="auto" w:fill="FFFFFF"/>
+            <w:shd w:fill="FFFFFF"/>
             <w:tcMar>
               <w:top w:w="80" w:type="dxa"/>
               <w:bottom w:w="80" w:type="dxa"/>
@@ -751,7 +753,7 @@
                 <w:color w:val="0AAE7B"/>
                 <w:sz w:val="17"/>
               </w:rPr>
-              <w:t>PASS 100%</w:t>
+              <w:t>PASS (100%)</w:t>
             </w:r>
           </w:p>
         </w:tc>
@@ -760,7 +762,7 @@
         <w:tc>
           <w:tcPr>
             <w:tcW w:type="dxa" w:w="2592"/>
-            <w:shd w:val="clear" w:color="auto" w:fill="F9FAFB"/>
+            <w:shd w:fill="F9FAFB"/>
             <w:tcMar>
               <w:top w:w="80" w:type="dxa"/>
               <w:bottom w:w="80" w:type="dxa"/>
@@ -779,14 +781,14 @@
                 <w:b/>
                 <w:sz w:val="17"/>
               </w:rPr>
-              <w:t>Kiểm thử Frontend Web</w:t>
+              <w:t>Kiểm thử giao diện Frontend</w:t>
             </w:r>
           </w:p>
         </w:tc>
         <w:tc>
           <w:tcPr>
             <w:tcW w:type="dxa" w:w="2592"/>
-            <w:shd w:val="clear" w:color="auto" w:fill="F9FAFB"/>
+            <w:shd w:fill="F9FAFB"/>
             <w:tcMar>
               <w:top w:w="80" w:type="dxa"/>
               <w:bottom w:w="80" w:type="dxa"/>
@@ -801,17 +803,18 @@
             <w:r>
               <w:rPr>
                 <w:rFonts w:ascii="Segoe UI" w:hAnsi="Segoe UI"/>
-                <w:color w:val="282828"/>
+                <w:b/>
+                <w:color w:val="0AAE7B"/>
                 <w:sz w:val="17"/>
               </w:rPr>
-              <w:t>Vitest UI &amp; Validation Suite</w:t>
+              <w:t>PASS toàn bộ UI vitest</w:t>
             </w:r>
           </w:p>
         </w:tc>
         <w:tc>
           <w:tcPr>
-            <w:tcW w:type="dxa" w:w="2880"/>
-            <w:shd w:val="clear" w:color="auto" w:fill="F9FAFB"/>
+            <w:tcW w:type="dxa" w:w="3312"/>
+            <w:shd w:fill="F9FAFB"/>
             <w:tcMar>
               <w:top w:w="80" w:type="dxa"/>
               <w:bottom w:w="80" w:type="dxa"/>
@@ -837,7 +840,7 @@
         <w:tc>
           <w:tcPr>
             <w:tcW w:type="dxa" w:w="1296"/>
-            <w:shd w:val="clear" w:color="auto" w:fill="F9FAFB"/>
+            <w:shd w:fill="F9FAFB"/>
             <w:tcMar>
               <w:top w:w="80" w:type="dxa"/>
               <w:bottom w:w="80" w:type="dxa"/>
@@ -856,7 +859,7 @@
                 <w:color w:val="0AAE7B"/>
                 <w:sz w:val="17"/>
               </w:rPr>
-              <w:t>PASS 100%</w:t>
+              <w:t>PASS (100%)</w:t>
             </w:r>
           </w:p>
         </w:tc>
@@ -865,7 +868,7 @@
         <w:tc>
           <w:tcPr>
             <w:tcW w:type="dxa" w:w="2592"/>
-            <w:shd w:val="clear" w:color="auto" w:fill="FFFFFF"/>
+            <w:shd w:fill="FFFFFF"/>
             <w:tcMar>
               <w:top w:w="80" w:type="dxa"/>
               <w:bottom w:w="80" w:type="dxa"/>
@@ -884,14 +887,14 @@
                 <w:b/>
                 <w:sz w:val="17"/>
               </w:rPr>
-              <w:t>Ma trận Excel TO-BE</w:t>
+              <w:t>Ma trận Excel TO-BE v1.0</w:t>
             </w:r>
           </w:p>
         </w:tc>
         <w:tc>
           <w:tcPr>
             <w:tcW w:type="dxa" w:w="2592"/>
-            <w:shd w:val="clear" w:color="auto" w:fill="FFFFFF"/>
+            <w:shd w:fill="FFFFFF"/>
             <w:tcMar>
               <w:top w:w="80" w:type="dxa"/>
               <w:bottom w:w="80" w:type="dxa"/>
@@ -909,14 +912,14 @@
                 <w:color w:val="282828"/>
                 <w:sz w:val="17"/>
               </w:rPr>
-              <w:t>7 Sheets đầy đủ, không cắt xén</w:t>
+              <w:t>7 Sheets đầy đủ, mở rộng 293 trường</w:t>
             </w:r>
           </w:p>
         </w:tc>
         <w:tc>
           <w:tcPr>
-            <w:tcW w:type="dxa" w:w="2880"/>
-            <w:shd w:val="clear" w:color="auto" w:fill="FFFFFF"/>
+            <w:tcW w:type="dxa" w:w="3312"/>
+            <w:shd w:fill="FFFFFF"/>
             <w:tcMar>
               <w:top w:w="80" w:type="dxa"/>
               <w:bottom w:w="80" w:type="dxa"/>
@@ -941,7 +944,7 @@
         <w:tc>
           <w:tcPr>
             <w:tcW w:type="dxa" w:w="1296"/>
-            <w:shd w:val="clear" w:color="auto" w:fill="FFFFFF"/>
+            <w:shd w:fill="FFFFFF"/>
             <w:tcMar>
               <w:top w:w="80" w:type="dxa"/>
               <w:bottom w:w="80" w:type="dxa"/>
@@ -960,7 +963,7 @@
                 <w:color w:val="0AAE7B"/>
                 <w:sz w:val="17"/>
               </w:rPr>
-              <w:t>PASS 100%</w:t>
+              <w:t>PASS (100%)</w:t>
             </w:r>
           </w:p>
         </w:tc>
@@ -969,7 +972,7 @@
         <w:tc>
           <w:tcPr>
             <w:tcW w:type="dxa" w:w="2592"/>
-            <w:shd w:val="clear" w:color="auto" w:fill="F9FAFB"/>
+            <w:shd w:fill="F9FAFB"/>
             <w:tcMar>
               <w:top w:w="80" w:type="dxa"/>
               <w:bottom w:w="80" w:type="dxa"/>
@@ -988,14 +991,14 @@
                 <w:b/>
                 <w:sz w:val="17"/>
               </w:rPr>
-              <w:t>Minh chứng giao diện</w:t>
+              <w:t>Bằng chứng giao diện thực tế</w:t>
             </w:r>
           </w:p>
         </w:tc>
         <w:tc>
           <w:tcPr>
             <w:tcW w:type="dxa" w:w="2592"/>
-            <w:shd w:val="clear" w:color="auto" w:fill="F9FAFB"/>
+            <w:shd w:fill="F9FAFB"/>
             <w:tcMar>
               <w:top w:w="80" w:type="dxa"/>
               <w:bottom w:w="80" w:type="dxa"/>
@@ -1013,14 +1016,14 @@
                 <w:color w:val="282828"/>
                 <w:sz w:val="17"/>
               </w:rPr>
-              <w:t>4 UI Flow thực tế (1920x1080)</w:t>
+              <w:t>4 Ảnh chụp độ phân giải 1920x1080</w:t>
             </w:r>
           </w:p>
         </w:tc>
         <w:tc>
           <w:tcPr>
-            <w:tcW w:type="dxa" w:w="2880"/>
-            <w:shd w:val="clear" w:color="auto" w:fill="F9FAFB"/>
+            <w:tcW w:type="dxa" w:w="3312"/>
+            <w:shd w:fill="F9FAFB"/>
             <w:tcMar>
               <w:top w:w="80" w:type="dxa"/>
               <w:bottom w:w="80" w:type="dxa"/>
@@ -1038,14 +1041,14 @@
                 <w:color w:val="282828"/>
                 <w:sz w:val="17"/>
               </w:rPr>
-              <w:t>4/4 Ảnh chụp sắc nét tại evidence/ folder</w:t>
+              <w:t>4 Ảnh chụp tại thư mục evidence/ không lỗi giả lập</w:t>
             </w:r>
           </w:p>
         </w:tc>
         <w:tc>
           <w:tcPr>
             <w:tcW w:type="dxa" w:w="1296"/>
-            <w:shd w:val="clear" w:color="auto" w:fill="F9FAFB"/>
+            <w:shd w:fill="F9FAFB"/>
             <w:tcMar>
               <w:top w:w="80" w:type="dxa"/>
               <w:bottom w:w="80" w:type="dxa"/>
@@ -1064,7 +1067,7 @@
                 <w:color w:val="0AAE7B"/>
                 <w:sz w:val="17"/>
               </w:rPr>
-              <w:t>PASS 100%</w:t>
+              <w:t>PASS (100%)</w:t>
             </w:r>
           </w:p>
         </w:tc>
@@ -1092,8 +1095,8 @@
       <w:tr>
         <w:tc>
           <w:tcPr>
-            <w:tcW w:type="dxa" w:w="9360"/>
-            <w:shd w:val="clear" w:color="auto" w:fill="F0F4F8"/>
+            <w:tcW w:type="dxa" w:w="9792"/>
+            <w:shd w:fill="F0F4F8"/>
             <w:tcMar>
               <w:top w:w="140" w:type="dxa"/>
               <w:bottom w:w="140" w:type="dxa"/>
@@ -1101,8 +1104,8 @@
               <w:right w:w="200" w:type="dxa"/>
             </w:tcMar>
             <w:tcBorders>
+              <w:top w:val="none"/>
               <w:left w:val="single" w:sz="24" w:space="0" w:color="1F497D"/>
-              <w:top w:val="none"/>
               <w:bottom w:val="none"/>
               <w:right w:val="none"/>
             </w:tcBorders>
@@ -1118,13 +1121,14 @@
                 <w:color w:val="1F497D"/>
                 <w:sz w:val="20"/>
               </w:rPr>
-              <w:t>[NGUYÊN TẮC 'ZERO-SHORTCUT' TRONG BẢN CODE CHÍNH THỨC]</w:t>
+              <w:t>📌 NGUYÊN TẮC 'ZERO-SHORTCUT' TRONG BẢN CODE CHÍNH THỨC</w:t>
               <w:br/>
             </w:r>
             <w:r>
               <w:rPr>
                 <w:rFonts w:ascii="Segoe UI" w:hAnsi="Segoe UI"/>
-                <w:color w:val="323232"/>
+                <w:i/>
+                <w:color w:val="3C3C3C"/>
                 <w:sz w:val="19"/>
               </w:rPr>
               <w:t>Toàn bộ 8 lối tắt (shortcuts) tự phát sinh trong bản thảo trước đây đã bị loại bỏ triệt để khỏi Codebase. Mọi logic tính toán, phân bổ và kế thừa đều tuân thủ nguyên tắc bảo toàn bản chất kinh tế tài chính và quyền chủ động của người dùng.</w:t>
@@ -1135,7 +1139,7 @@
     </w:tbl>
     <w:p>
       <w:pPr>
-        <w:spacing w:after="80"/>
+        <w:spacing w:after="120"/>
       </w:pPr>
     </w:p>
     <w:tbl>
@@ -1155,7 +1159,7 @@
         <w:tc>
           <w:tcPr>
             <w:tcW w:type="dxa" w:w="1152"/>
-            <w:shd w:val="clear" w:color="auto" w:fill="1F497D"/>
+            <w:shd w:fill="1F497D"/>
             <w:tcMar>
               <w:top w:w="100" w:type="dxa"/>
               <w:bottom w:w="100" w:type="dxa"/>
@@ -1182,7 +1186,7 @@
         <w:tc>
           <w:tcPr>
             <w:tcW w:type="dxa" w:w="3024"/>
-            <w:shd w:val="clear" w:color="auto" w:fill="1F497D"/>
+            <w:shd w:fill="1F497D"/>
             <w:tcMar>
               <w:top w:w="100" w:type="dxa"/>
               <w:bottom w:w="100" w:type="dxa"/>
@@ -1209,7 +1213,7 @@
         <w:tc>
           <w:tcPr>
             <w:tcW w:type="dxa" w:w="3888"/>
-            <w:shd w:val="clear" w:color="auto" w:fill="1F497D"/>
+            <w:shd w:fill="1F497D"/>
             <w:tcMar>
               <w:top w:w="100" w:type="dxa"/>
               <w:bottom w:w="100" w:type="dxa"/>
@@ -1236,7 +1240,7 @@
         <w:tc>
           <w:tcPr>
             <w:tcW w:type="dxa" w:w="1296"/>
-            <w:shd w:val="clear" w:color="auto" w:fill="1F497D"/>
+            <w:shd w:fill="1F497D"/>
             <w:tcMar>
               <w:top w:w="100" w:type="dxa"/>
               <w:bottom w:w="100" w:type="dxa"/>
@@ -1265,7 +1269,7 @@
         <w:tc>
           <w:tcPr>
             <w:tcW w:type="dxa" w:w="1152"/>
-            <w:shd w:val="clear" w:color="auto" w:fill="FFFFFF"/>
+            <w:shd w:fill="FFFFFF"/>
             <w:tcMar>
               <w:top w:w="80" w:type="dxa"/>
               <w:bottom w:w="80" w:type="dxa"/>
@@ -1291,7 +1295,7 @@
         <w:tc>
           <w:tcPr>
             <w:tcW w:type="dxa" w:w="3024"/>
-            <w:shd w:val="clear" w:color="auto" w:fill="FFFFFF"/>
+            <w:shd w:fill="FFFFFF"/>
             <w:tcMar>
               <w:top w:w="80" w:type="dxa"/>
               <w:bottom w:w="80" w:type="dxa"/>
@@ -1316,7 +1320,7 @@
         <w:tc>
           <w:tcPr>
             <w:tcW w:type="dxa" w:w="3888"/>
-            <w:shd w:val="clear" w:color="auto" w:fill="FFFFFF"/>
+            <w:shd w:fill="FFFFFF"/>
             <w:tcMar>
               <w:top w:w="80" w:type="dxa"/>
               <w:bottom w:w="80" w:type="dxa"/>
@@ -1334,14 +1338,14 @@
                 <w:color w:val="282828"/>
                 <w:sz w:val="17"/>
               </w:rPr>
-              <w:t>Đồng bộ tuyệt đối 289 trường = 113 (Vận hành) + 60 (Bảng giá) + 45 (Chi phí/DT) + 35 (Công nợ) + 36 (Danh mục).</w:t>
+              <w:t>Đồng bộ tuyệt đối 293 trường = 117 (Vận hành) + 60 (Bảng giá) + 45 (Chi phí/DT) + 35 (Công nợ) + 36 (Danh mục), bổ sung 4 trường số đo Chặng (GAP-12).</w:t>
             </w:r>
           </w:p>
         </w:tc>
         <w:tc>
           <w:tcPr>
             <w:tcW w:type="dxa" w:w="1296"/>
-            <w:shd w:val="clear" w:color="auto" w:fill="FFFFFF"/>
+            <w:shd w:fill="FFFFFF"/>
             <w:tcMar>
               <w:top w:w="80" w:type="dxa"/>
               <w:bottom w:w="80" w:type="dxa"/>
@@ -1369,7 +1373,7 @@
         <w:tc>
           <w:tcPr>
             <w:tcW w:type="dxa" w:w="1152"/>
-            <w:shd w:val="clear" w:color="auto" w:fill="F9FAFB"/>
+            <w:shd w:fill="F9FAFB"/>
             <w:tcMar>
               <w:top w:w="80" w:type="dxa"/>
               <w:bottom w:w="80" w:type="dxa"/>
@@ -1395,7 +1399,7 @@
         <w:tc>
           <w:tcPr>
             <w:tcW w:type="dxa" w:w="3024"/>
-            <w:shd w:val="clear" w:color="auto" w:fill="F9FAFB"/>
+            <w:shd w:fill="F9FAFB"/>
             <w:tcMar>
               <w:top w:w="80" w:type="dxa"/>
               <w:bottom w:w="80" w:type="dxa"/>
@@ -1420,7 +1424,7 @@
         <w:tc>
           <w:tcPr>
             <w:tcW w:type="dxa" w:w="3888"/>
-            <w:shd w:val="clear" w:color="auto" w:fill="F9FAFB"/>
+            <w:shd w:fill="F9FAFB"/>
             <w:tcMar>
               <w:top w:w="80" w:type="dxa"/>
               <w:bottom w:w="80" w:type="dxa"/>
@@ -1438,14 +1442,14 @@
                 <w:color w:val="282828"/>
                 <w:sz w:val="17"/>
               </w:rPr>
-              <w:t>Cung cấp đầy đủ commit SHA, test execution log 447 tests và ảnh chụp 4 luồng giao diện thực tế.</w:t>
+              <w:t>Cung cấp đầy đủ commit SHA f48ec14, test execution log 447 tests .NET, 30 vitest và 4 ảnh chụp luồng UI thực tế.</w:t>
             </w:r>
           </w:p>
         </w:tc>
         <w:tc>
           <w:tcPr>
             <w:tcW w:type="dxa" w:w="1296"/>
-            <w:shd w:val="clear" w:color="auto" w:fill="F9FAFB"/>
+            <w:shd w:fill="F9FAFB"/>
             <w:tcMar>
               <w:top w:w="80" w:type="dxa"/>
               <w:bottom w:w="80" w:type="dxa"/>
@@ -1473,7 +1477,7 @@
         <w:tc>
           <w:tcPr>
             <w:tcW w:type="dxa" w:w="1152"/>
-            <w:shd w:val="clear" w:color="auto" w:fill="FFFFFF"/>
+            <w:shd w:fill="FFFFFF"/>
             <w:tcMar>
               <w:top w:w="80" w:type="dxa"/>
               <w:bottom w:w="80" w:type="dxa"/>
@@ -1499,7 +1503,7 @@
         <w:tc>
           <w:tcPr>
             <w:tcW w:type="dxa" w:w="3024"/>
-            <w:shd w:val="clear" w:color="auto" w:fill="FFFFFF"/>
+            <w:shd w:fill="FFFFFF"/>
             <w:tcMar>
               <w:top w:w="80" w:type="dxa"/>
               <w:bottom w:w="80" w:type="dxa"/>
@@ -1517,14 +1521,14 @@
                 <w:color w:val="282828"/>
                 <w:sz w:val="17"/>
               </w:rPr>
-              <w:t>Cặp kế thừa Luồng 6 bị lệch số đếm</w:t>
+              <w:t>Trường Rate Card header lệch baseline mới</w:t>
             </w:r>
           </w:p>
         </w:tc>
         <w:tc>
           <w:tcPr>
             <w:tcW w:type="dxa" w:w="3888"/>
-            <w:shd w:val="clear" w:color="auto" w:fill="FFFFFF"/>
+            <w:shd w:fill="FFFFFF"/>
             <w:tcMar>
               <w:top w:w="80" w:type="dxa"/>
               <w:bottom w:w="80" w:type="dxa"/>
@@ -1542,14 +1546,14 @@
                 <w:color w:val="282828"/>
                 <w:sz w:val="17"/>
               </w:rPr>
-              <w:t>Khớp chính xác 73 cặp luồng (72 cặp triển khai &amp; pass UAT, Cặp 68 giữ Không kế thừa theo đúng GAP-08).</w:t>
+              <w:t>RATE-STRUCT đa tuyến rule-level: UI và API v1.0 hỗ trợ khai báo tuyến/phương thức linh hoạt ở từng rule; liên kết phụ phí để ngỏ routeCode (UT-16).</w:t>
             </w:r>
           </w:p>
         </w:tc>
         <w:tc>
           <w:tcPr>
             <w:tcW w:type="dxa" w:w="1296"/>
-            <w:shd w:val="clear" w:color="auto" w:fill="FFFFFF"/>
+            <w:shd w:fill="FFFFFF"/>
             <w:tcMar>
               <w:top w:w="80" w:type="dxa"/>
               <w:bottom w:w="80" w:type="dxa"/>
@@ -1577,7 +1581,7 @@
         <w:tc>
           <w:tcPr>
             <w:tcW w:type="dxa" w:w="1152"/>
-            <w:shd w:val="clear" w:color="auto" w:fill="F9FAFB"/>
+            <w:shd w:fill="F9FAFB"/>
             <w:tcMar>
               <w:top w:w="80" w:type="dxa"/>
               <w:bottom w:w="80" w:type="dxa"/>
@@ -1603,7 +1607,7 @@
         <w:tc>
           <w:tcPr>
             <w:tcW w:type="dxa" w:w="3024"/>
-            <w:shd w:val="clear" w:color="auto" w:fill="F9FAFB"/>
+            <w:shd w:fill="F9FAFB"/>
             <w:tcMar>
               <w:top w:w="80" w:type="dxa"/>
               <w:bottom w:w="80" w:type="dxa"/>
@@ -1628,7 +1632,7 @@
         <w:tc>
           <w:tcPr>
             <w:tcW w:type="dxa" w:w="3888"/>
-            <w:shd w:val="clear" w:color="auto" w:fill="F9FAFB"/>
+            <w:shd w:fill="F9FAFB"/>
             <w:tcMar>
               <w:top w:w="80" w:type="dxa"/>
               <w:bottom w:w="80" w:type="dxa"/>
@@ -1646,14 +1650,14 @@
                 <w:color w:val="282828"/>
                 <w:sz w:val="17"/>
               </w:rPr>
-              <w:t>Chặn tự sinh mã giả; ném lỗi tường minh khi thiếu EconomicChargeType mapping trên master (UT-26, DO-10).</w:t>
+              <w:t>Xóa bỏ toàn bộ mã 641/511 giả lập; ném lỗi tường minh khi thiếu EconomicChargeType mapping trên master (UT-26, DO-10).</w:t>
             </w:r>
           </w:p>
         </w:tc>
         <w:tc>
           <w:tcPr>
             <w:tcW w:type="dxa" w:w="1296"/>
-            <w:shd w:val="clear" w:color="auto" w:fill="F9FAFB"/>
+            <w:shd w:fill="F9FAFB"/>
             <w:tcMar>
               <w:top w:w="80" w:type="dxa"/>
               <w:bottom w:w="80" w:type="dxa"/>
@@ -1681,7 +1685,7 @@
         <w:tc>
           <w:tcPr>
             <w:tcW w:type="dxa" w:w="1152"/>
-            <w:shd w:val="clear" w:color="auto" w:fill="FFFFFF"/>
+            <w:shd w:fill="FFFFFF"/>
             <w:tcMar>
               <w:top w:w="80" w:type="dxa"/>
               <w:bottom w:w="80" w:type="dxa"/>
@@ -1707,7 +1711,7 @@
         <w:tc>
           <w:tcPr>
             <w:tcW w:type="dxa" w:w="3024"/>
-            <w:shd w:val="clear" w:color="auto" w:fill="FFFFFF"/>
+            <w:shd w:fill="FFFFFF"/>
             <w:tcMar>
               <w:top w:w="80" w:type="dxa"/>
               <w:bottom w:w="80" w:type="dxa"/>
@@ -1732,7 +1736,7 @@
         <w:tc>
           <w:tcPr>
             <w:tcW w:type="dxa" w:w="3888"/>
-            <w:shd w:val="clear" w:color="auto" w:fill="FFFFFF"/>
+            <w:shd w:fill="FFFFFF"/>
             <w:tcMar>
               <w:top w:w="80" w:type="dxa"/>
               <w:bottom w:w="80" w:type="dxa"/>
@@ -1750,14 +1754,14 @@
                 <w:color w:val="282828"/>
                 <w:sz w:val="17"/>
               </w:rPr>
-              <w:t>Xóa bỏ auto-pick; khi khác Customer, Origin/Dest hoặc ETD, trường trả về null và flag Conflict (UT-02, UT-03, DO-01).</w:t>
+              <w:t>Xóa bỏ auto-pick; khi khác Customer, Origin/Dest hoặc ETD, trường đích trả về null và flag Conflict (UT-02, UT-03, DO-01).</w:t>
             </w:r>
           </w:p>
         </w:tc>
         <w:tc>
           <w:tcPr>
             <w:tcW w:type="dxa" w:w="1296"/>
-            <w:shd w:val="clear" w:color="auto" w:fill="FFFFFF"/>
+            <w:shd w:fill="FFFFFF"/>
             <w:tcMar>
               <w:top w:w="80" w:type="dxa"/>
               <w:bottom w:w="80" w:type="dxa"/>
@@ -1785,7 +1789,7 @@
         <w:tc>
           <w:tcPr>
             <w:tcW w:type="dxa" w:w="1152"/>
-            <w:shd w:val="clear" w:color="auto" w:fill="F9FAFB"/>
+            <w:shd w:fill="F9FAFB"/>
             <w:tcMar>
               <w:top w:w="80" w:type="dxa"/>
               <w:bottom w:w="80" w:type="dxa"/>
@@ -1811,7 +1815,7 @@
         <w:tc>
           <w:tcPr>
             <w:tcW w:type="dxa" w:w="3024"/>
-            <w:shd w:val="clear" w:color="auto" w:fill="F9FAFB"/>
+            <w:shd w:fill="F9FAFB"/>
             <w:tcMar>
               <w:top w:w="80" w:type="dxa"/>
               <w:bottom w:w="80" w:type="dxa"/>
@@ -1836,7 +1840,7 @@
         <w:tc>
           <w:tcPr>
             <w:tcW w:type="dxa" w:w="3888"/>
-            <w:shd w:val="clear" w:color="auto" w:fill="F9FAFB"/>
+            <w:shd w:fill="F9FAFB"/>
             <w:tcMar>
               <w:top w:w="80" w:type="dxa"/>
               <w:bottom w:w="80" w:type="dxa"/>
@@ -1854,14 +1858,14 @@
                 <w:color w:val="282828"/>
                 <w:sz w:val="17"/>
               </w:rPr>
-              <w:t>Hỗ trợ Rollup phân bổ theo tỷ lệ (AllocationItems) khi Bill đi qua nhiều Shipment (UT-07, DO-02).</w:t>
+              <w:t>Hỗ trợ Rollup phân bổ theo tỷ lệ (AllocationItems) khi Bill đi qua nhiều Shipment tránh nhân đôi số đo (UT-07, DO-02).</w:t>
             </w:r>
           </w:p>
         </w:tc>
         <w:tc>
           <w:tcPr>
             <w:tcW w:type="dxa" w:w="1296"/>
-            <w:shd w:val="clear" w:color="auto" w:fill="F9FAFB"/>
+            <w:shd w:fill="F9FAFB"/>
             <w:tcMar>
               <w:top w:w="80" w:type="dxa"/>
               <w:bottom w:w="80" w:type="dxa"/>
@@ -1889,7 +1893,7 @@
         <w:tc>
           <w:tcPr>
             <w:tcW w:type="dxa" w:w="1152"/>
-            <w:shd w:val="clear" w:color="auto" w:fill="FFFFFF"/>
+            <w:shd w:fill="FFFFFF"/>
             <w:tcMar>
               <w:top w:w="80" w:type="dxa"/>
               <w:bottom w:w="80" w:type="dxa"/>
@@ -1915,7 +1919,7 @@
         <w:tc>
           <w:tcPr>
             <w:tcW w:type="dxa" w:w="3024"/>
-            <w:shd w:val="clear" w:color="auto" w:fill="FFFFFF"/>
+            <w:shd w:fill="FFFFFF"/>
             <w:tcMar>
               <w:top w:w="80" w:type="dxa"/>
               <w:bottom w:w="80" w:type="dxa"/>
@@ -1940,7 +1944,7 @@
         <w:tc>
           <w:tcPr>
             <w:tcW w:type="dxa" w:w="3888"/>
-            <w:shd w:val="clear" w:color="auto" w:fill="FFFFFF"/>
+            <w:shd w:fill="FFFFFF"/>
             <w:tcMar>
               <w:top w:w="80" w:type="dxa"/>
               <w:bottom w:w="80" w:type="dxa"/>
@@ -1965,7 +1969,7 @@
         <w:tc>
           <w:tcPr>
             <w:tcW w:type="dxa" w:w="1296"/>
-            <w:shd w:val="clear" w:color="auto" w:fill="FFFFFF"/>
+            <w:shd w:fill="FFFFFF"/>
             <w:tcMar>
               <w:top w:w="80" w:type="dxa"/>
               <w:bottom w:w="80" w:type="dxa"/>
@@ -1993,7 +1997,7 @@
         <w:tc>
           <w:tcPr>
             <w:tcW w:type="dxa" w:w="1152"/>
-            <w:shd w:val="clear" w:color="auto" w:fill="F9FAFB"/>
+            <w:shd w:fill="F9FAFB"/>
             <w:tcMar>
               <w:top w:w="80" w:type="dxa"/>
               <w:bottom w:w="80" w:type="dxa"/>
@@ -2019,7 +2023,7 @@
         <w:tc>
           <w:tcPr>
             <w:tcW w:type="dxa" w:w="3024"/>
-            <w:shd w:val="clear" w:color="auto" w:fill="F9FAFB"/>
+            <w:shd w:fill="F9FAFB"/>
             <w:tcMar>
               <w:top w:w="80" w:type="dxa"/>
               <w:bottom w:w="80" w:type="dxa"/>
@@ -2044,7 +2048,7 @@
         <w:tc>
           <w:tcPr>
             <w:tcW w:type="dxa" w:w="3888"/>
-            <w:shd w:val="clear" w:color="auto" w:fill="F9FAFB"/>
+            <w:shd w:fill="F9FAFB"/>
             <w:tcMar>
               <w:top w:w="80" w:type="dxa"/>
               <w:bottom w:w="80" w:type="dxa"/>
@@ -2062,14 +2066,14 @@
                 <w:color w:val="282828"/>
                 <w:sz w:val="17"/>
               </w:rPr>
-              <w:t>Bảo lưu quyết định nghiệp vụ chuẩn: Due Date (nghĩa vụ nợ) KHÔNG kế thừa sang Collection Date (dòng tiền thực tế) (Cặp 68).</w:t>
+              <w:t>Bảo lưu quyết định chuẩn: Due Date (nghĩa vụ nợ) KHÔNG kế thừa sang Collection Date (dòng tiền thực tế) (Cặp 68, UT-22).</w:t>
             </w:r>
           </w:p>
         </w:tc>
         <w:tc>
           <w:tcPr>
             <w:tcW w:type="dxa" w:w="1296"/>
-            <w:shd w:val="clear" w:color="auto" w:fill="F9FAFB"/>
+            <w:shd w:fill="F9FAFB"/>
             <w:tcMar>
               <w:top w:w="80" w:type="dxa"/>
               <w:bottom w:w="80" w:type="dxa"/>
@@ -2097,7 +2101,7 @@
         <w:tc>
           <w:tcPr>
             <w:tcW w:type="dxa" w:w="1152"/>
-            <w:shd w:val="clear" w:color="auto" w:fill="FFFFFF"/>
+            <w:shd w:fill="FFFFFF"/>
             <w:tcMar>
               <w:top w:w="80" w:type="dxa"/>
               <w:bottom w:w="80" w:type="dxa"/>
@@ -2123,7 +2127,7 @@
         <w:tc>
           <w:tcPr>
             <w:tcW w:type="dxa" w:w="3024"/>
-            <w:shd w:val="clear" w:color="auto" w:fill="FFFFFF"/>
+            <w:shd w:fill="FFFFFF"/>
             <w:tcMar>
               <w:top w:w="80" w:type="dxa"/>
               <w:bottom w:w="80" w:type="dxa"/>
@@ -2148,7 +2152,7 @@
         <w:tc>
           <w:tcPr>
             <w:tcW w:type="dxa" w:w="3888"/>
-            <w:shd w:val="clear" w:color="auto" w:fill="FFFFFF"/>
+            <w:shd w:fill="FFFFFF"/>
             <w:tcMar>
               <w:top w:w="80" w:type="dxa"/>
               <w:bottom w:w="80" w:type="dxa"/>
@@ -2166,14 +2170,14 @@
                 <w:color w:val="282828"/>
                 <w:sz w:val="17"/>
               </w:rPr>
-              <w:t>Tách bạch triệt để Carrier (vận hành) và VendorPartyId (tài chính); không tự điền Vendor sang Carrier (UT-11, DO-03).</w:t>
+              <w:t>Tách bạch triệt để Carrier (vận hành) và VendorPartyId/Payee (tài chính); cho phép chọn Payee linh hoạt kèm audit trail (UT-21, DO-03).</w:t>
             </w:r>
           </w:p>
         </w:tc>
         <w:tc>
           <w:tcPr>
             <w:tcW w:type="dxa" w:w="1296"/>
-            <w:shd w:val="clear" w:color="auto" w:fill="FFFFFF"/>
+            <w:shd w:fill="FFFFFF"/>
             <w:tcMar>
               <w:top w:w="80" w:type="dxa"/>
               <w:bottom w:w="80" w:type="dxa"/>
@@ -2201,7 +2205,7 @@
         <w:tc>
           <w:tcPr>
             <w:tcW w:type="dxa" w:w="1152"/>
-            <w:shd w:val="clear" w:color="auto" w:fill="F9FAFB"/>
+            <w:shd w:fill="F9FAFB"/>
             <w:tcMar>
               <w:top w:w="80" w:type="dxa"/>
               <w:bottom w:w="80" w:type="dxa"/>
@@ -2227,7 +2231,7 @@
         <w:tc>
           <w:tcPr>
             <w:tcW w:type="dxa" w:w="3024"/>
-            <w:shd w:val="clear" w:color="auto" w:fill="F9FAFB"/>
+            <w:shd w:fill="F9FAFB"/>
             <w:tcMar>
               <w:top w:w="80" w:type="dxa"/>
               <w:bottom w:w="80" w:type="dxa"/>
@@ -2245,14 +2249,14 @@
                 <w:color w:val="282828"/>
                 <w:sz w:val="17"/>
               </w:rPr>
-              <w:t>Tự gán Cảng đích cuối cho Chặng giữa</w:t>
+              <w:t>Rate Card multi-route -&gt; Surcharge single mode</w:t>
             </w:r>
           </w:p>
         </w:tc>
         <w:tc>
           <w:tcPr>
             <w:tcW w:type="dxa" w:w="3888"/>
-            <w:shd w:val="clear" w:color="auto" w:fill="F9FAFB"/>
+            <w:shd w:fill="F9FAFB"/>
             <w:tcMar>
               <w:top w:w="80" w:type="dxa"/>
               <w:bottom w:w="80" w:type="dxa"/>
@@ -2270,14 +2274,14 @@
                 <w:color w:val="282828"/>
                 <w:sz w:val="17"/>
               </w:rPr>
-              <w:t>Chặng giữa trong chuỗi 3 chặng để ngỏ Cảng đến (destination = null) cho phép điều phối linh hoạt (UT-11, DO-04).</w:t>
+              <w:t>Surcharge liên kết Rate Card đa tuyến để ngỏ RouteCode = null, cho phép người dùng tự do chọn scope áp dụng (UT-16).</w:t>
             </w:r>
           </w:p>
         </w:tc>
         <w:tc>
           <w:tcPr>
             <w:tcW w:type="dxa" w:w="1296"/>
-            <w:shd w:val="clear" w:color="auto" w:fill="F9FAFB"/>
+            <w:shd w:fill="F9FAFB"/>
             <w:tcMar>
               <w:top w:w="80" w:type="dxa"/>
               <w:bottom w:w="80" w:type="dxa"/>
@@ -2305,7 +2309,7 @@
         <w:tc>
           <w:tcPr>
             <w:tcW w:type="dxa" w:w="1152"/>
-            <w:shd w:val="clear" w:color="auto" w:fill="FFFFFF"/>
+            <w:shd w:fill="FFFFFF"/>
             <w:tcMar>
               <w:top w:w="80" w:type="dxa"/>
               <w:bottom w:w="80" w:type="dxa"/>
@@ -2331,7 +2335,7 @@
         <w:tc>
           <w:tcPr>
             <w:tcW w:type="dxa" w:w="3024"/>
-            <w:shd w:val="clear" w:color="auto" w:fill="FFFFFF"/>
+            <w:shd w:fill="FFFFFF"/>
             <w:tcMar>
               <w:top w:w="80" w:type="dxa"/>
               <w:bottom w:w="80" w:type="dxa"/>
@@ -2349,14 +2353,14 @@
                 <w:color w:val="282828"/>
                 <w:sz w:val="17"/>
               </w:rPr>
-              <w:t>Ép Route cho Phụ phí đa tuyến trên Bill</w:t>
+              <w:t>Chứng từ bên ngoài khác Cost/Revenue dự tính</w:t>
             </w:r>
           </w:p>
         </w:tc>
         <w:tc>
           <w:tcPr>
             <w:tcW w:type="dxa" w:w="3888"/>
-            <w:shd w:val="clear" w:color="auto" w:fill="FFFFFF"/>
+            <w:shd w:fill="FFFFFF"/>
             <w:tcMar>
               <w:top w:w="80" w:type="dxa"/>
               <w:bottom w:w="80" w:type="dxa"/>
@@ -2374,14 +2378,14 @@
                 <w:color w:val="282828"/>
                 <w:sz w:val="17"/>
               </w:rPr>
-              <w:t>Phụ phí đa tuyến áp dụng trên Bill có nhiều tuyến thì RouteCode để ngỏ (null) chứ không gán ép tuyến đầu (UT-16, DO-06).</w:t>
+              <w:t>Hóa đơn NCC bên ngoài là Source of Truth (1.050.000 VND), LCMS ghi nhận đúng số thực tế và theo dõi chênh lệch Mode A (UT-20).</w:t>
             </w:r>
           </w:p>
         </w:tc>
         <w:tc>
           <w:tcPr>
             <w:tcW w:type="dxa" w:w="1296"/>
-            <w:shd w:val="clear" w:color="auto" w:fill="FFFFFF"/>
+            <w:shd w:fill="FFFFFF"/>
             <w:tcMar>
               <w:top w:w="80" w:type="dxa"/>
               <w:bottom w:w="80" w:type="dxa"/>
@@ -2409,7 +2413,7 @@
         <w:tc>
           <w:tcPr>
             <w:tcW w:type="dxa" w:w="1152"/>
-            <w:shd w:val="clear" w:color="auto" w:fill="F9FAFB"/>
+            <w:shd w:fill="F9FAFB"/>
             <w:tcMar>
               <w:top w:w="80" w:type="dxa"/>
               <w:bottom w:w="80" w:type="dxa"/>
@@ -2435,7 +2439,7 @@
         <w:tc>
           <w:tcPr>
             <w:tcW w:type="dxa" w:w="3024"/>
-            <w:shd w:val="clear" w:color="auto" w:fill="F9FAFB"/>
+            <w:shd w:fill="F9FAFB"/>
             <w:tcMar>
               <w:top w:w="80" w:type="dxa"/>
               <w:bottom w:w="80" w:type="dxa"/>
@@ -2453,14 +2457,14 @@
                 <w:color w:val="282828"/>
                 <w:sz w:val="17"/>
               </w:rPr>
-              <w:t>Mượn trọng lượng tổng của Bill cho Chặng</w:t>
+              <w:t>Khai báo Chặng chưa có weight trong 289 field list</w:t>
             </w:r>
           </w:p>
         </w:tc>
         <w:tc>
           <w:tcPr>
             <w:tcW w:type="dxa" w:w="3888"/>
-            <w:shd w:val="clear" w:color="auto" w:fill="F9FAFB"/>
+            <w:shd w:fill="F9FAFB"/>
             <w:tcMar>
               <w:top w:w="80" w:type="dxa"/>
               <w:bottom w:w="80" w:type="dxa"/>
@@ -2478,14 +2482,14 @@
                 <w:color w:val="282828"/>
                 <w:sz w:val="17"/>
               </w:rPr>
-              <w:t>Chặn tính giá theo Chặng nếu chặng thiếu trọng lượng (HTTP 409 Conflict); cấm lấy trọng lượng Bill (UT-14, DO-05).</w:t>
+              <w:t>Bổ sung 4 trường số đo Chặng (grossWeightKg, volumeCbm, chargeableWeightKg, packageCount) vào Sheet 02 (tăng lên 293 trường); UT-14 chặn rating khi thiếu weight.</w:t>
             </w:r>
           </w:p>
         </w:tc>
         <w:tc>
           <w:tcPr>
             <w:tcW w:type="dxa" w:w="1296"/>
-            <w:shd w:val="clear" w:color="auto" w:fill="F9FAFB"/>
+            <w:shd w:fill="F9FAFB"/>
             <w:tcMar>
               <w:top w:w="80" w:type="dxa"/>
               <w:bottom w:w="80" w:type="dxa"/>
@@ -2513,7 +2517,7 @@
         <w:tc>
           <w:tcPr>
             <w:tcW w:type="dxa" w:w="1152"/>
-            <w:shd w:val="clear" w:color="auto" w:fill="FFFFFF"/>
+            <w:shd w:fill="FFFFFF"/>
             <w:tcMar>
               <w:top w:w="80" w:type="dxa"/>
               <w:bottom w:w="80" w:type="dxa"/>
@@ -2539,7 +2543,7 @@
         <w:tc>
           <w:tcPr>
             <w:tcW w:type="dxa" w:w="3024"/>
-            <w:shd w:val="clear" w:color="auto" w:fill="FFFFFF"/>
+            <w:shd w:fill="FFFFFF"/>
             <w:tcMar>
               <w:top w:w="80" w:type="dxa"/>
               <w:bottom w:w="80" w:type="dxa"/>
@@ -2557,14 +2561,14 @@
                 <w:color w:val="282828"/>
                 <w:sz w:val="17"/>
               </w:rPr>
-              <w:t>Sửa số đo Bill làm thay đổi snapshot giá cũ</w:t>
+              <w:t>Cùng mã master khác taxonomy</w:t>
             </w:r>
           </w:p>
         </w:tc>
         <w:tc>
           <w:tcPr>
             <w:tcW w:type="dxa" w:w="3888"/>
-            <w:shd w:val="clear" w:color="auto" w:fill="FFFFFF"/>
+            <w:shd w:fill="FFFFFF"/>
             <w:tcMar>
               <w:top w:w="80" w:type="dxa"/>
               <w:bottom w:w="80" w:type="dxa"/>
@@ -2579,18 +2583,17 @@
             <w:r>
               <w:rPr>
                 <w:rFonts w:ascii="Segoe UI" w:hAnsi="Segoe UI"/>
-                <w:b/>
-                <w:color w:val="0AAE7B"/>
+                <w:color w:val="282828"/>
                 <w:sz w:val="17"/>
               </w:rPr>
-              <w:t>Đảm bảo tính bất biến 100% của bản snapshot tính giá; thay đổi số đo Bill sau này không ảnh hưởng (UT-15, DO-05).</w:t>
+              <w:t>Phân tách rõ taxonomy: Phương thức vận tải (transport_mode), Mã dịch vụ (service_type), Phân loại hàng hóa (commodity); giữ taxonomy độc lập.</w:t>
             </w:r>
           </w:p>
         </w:tc>
         <w:tc>
           <w:tcPr>
             <w:tcW w:type="dxa" w:w="1296"/>
-            <w:shd w:val="clear" w:color="auto" w:fill="FFFFFF"/>
+            <w:shd w:fill="FFFFFF"/>
             <w:tcMar>
               <w:top w:w="80" w:type="dxa"/>
               <w:bottom w:w="80" w:type="dxa"/>
@@ -2618,7 +2621,7 @@
         <w:tc>
           <w:tcPr>
             <w:tcW w:type="dxa" w:w="1152"/>
-            <w:shd w:val="clear" w:color="auto" w:fill="F9FAFB"/>
+            <w:shd w:fill="F9FAFB"/>
             <w:tcMar>
               <w:top w:w="80" w:type="dxa"/>
               <w:bottom w:w="80" w:type="dxa"/>
@@ -2644,7 +2647,7 @@
         <w:tc>
           <w:tcPr>
             <w:tcW w:type="dxa" w:w="3024"/>
-            <w:shd w:val="clear" w:color="auto" w:fill="F9FAFB"/>
+            <w:shd w:fill="F9FAFB"/>
             <w:tcMar>
               <w:top w:w="80" w:type="dxa"/>
               <w:bottom w:w="80" w:type="dxa"/>
@@ -2662,14 +2665,14 @@
                 <w:color w:val="282828"/>
                 <w:sz w:val="17"/>
               </w:rPr>
-              <w:t>Thiếu kiểm soát phân quyền phía Server</w:t>
+              <w:t>Không phải mọi cột là trường nhập thực</w:t>
             </w:r>
           </w:p>
         </w:tc>
         <w:tc>
           <w:tcPr>
             <w:tcW w:type="dxa" w:w="3888"/>
-            <w:shd w:val="clear" w:color="auto" w:fill="F9FAFB"/>
+            <w:shd w:fill="F9FAFB"/>
             <w:tcMar>
               <w:top w:w="80" w:type="dxa"/>
               <w:bottom w:w="80" w:type="dxa"/>
@@ -2687,14 +2690,14 @@
                 <w:color w:val="282828"/>
                 <w:sz w:val="17"/>
               </w:rPr>
-              <w:t>Chặn phân quyền chặt chẽ trên máy chủ (HTTP 403 Forbidden) khi người dùng không có quyền chi phí (UT-27, DO-11).</w:t>
+              <w:t>Bổ sung cột phân loại 5 nhóm rõ ràng cho toàn bộ 293 trường tại Sheet 02: Nhập tay, Danh mục, Kế thừa có xác nhận, Tự tính/Tự sinh, Chỉ đọc/Trạng thái.</w:t>
             </w:r>
           </w:p>
         </w:tc>
         <w:tc>
           <w:tcPr>
             <w:tcW w:type="dxa" w:w="1296"/>
-            <w:shd w:val="clear" w:color="auto" w:fill="F9FAFB"/>
+            <w:shd w:fill="F9FAFB"/>
             <w:tcMar>
               <w:top w:w="80" w:type="dxa"/>
               <w:bottom w:w="80" w:type="dxa"/>
@@ -2746,7 +2749,7 @@
         <w:tc>
           <w:tcPr>
             <w:tcW w:type="dxa" w:w="1152"/>
-            <w:shd w:val="clear" w:color="auto" w:fill="1F497D"/>
+            <w:shd w:fill="1F497D"/>
             <w:tcMar>
               <w:top w:w="100" w:type="dxa"/>
               <w:bottom w:w="100" w:type="dxa"/>
@@ -2773,7 +2776,7 @@
         <w:tc>
           <w:tcPr>
             <w:tcW w:type="dxa" w:w="1728"/>
-            <w:shd w:val="clear" w:color="auto" w:fill="1F497D"/>
+            <w:shd w:fill="1F497D"/>
             <w:tcMar>
               <w:top w:w="100" w:type="dxa"/>
               <w:bottom w:w="100" w:type="dxa"/>
@@ -2800,7 +2803,7 @@
         <w:tc>
           <w:tcPr>
             <w:tcW w:type="dxa" w:w="2880"/>
-            <w:shd w:val="clear" w:color="auto" w:fill="1F497D"/>
+            <w:shd w:fill="1F497D"/>
             <w:tcMar>
               <w:top w:w="100" w:type="dxa"/>
               <w:bottom w:w="100" w:type="dxa"/>
@@ -2827,7 +2830,7 @@
         <w:tc>
           <w:tcPr>
             <w:tcW w:type="dxa" w:w="2880"/>
-            <w:shd w:val="clear" w:color="auto" w:fill="1F497D"/>
+            <w:shd w:fill="1F497D"/>
             <w:tcMar>
               <w:top w:w="100" w:type="dxa"/>
               <w:bottom w:w="100" w:type="dxa"/>
@@ -2854,7 +2857,7 @@
         <w:tc>
           <w:tcPr>
             <w:tcW w:type="dxa" w:w="720"/>
-            <w:shd w:val="clear" w:color="auto" w:fill="1F497D"/>
+            <w:shd w:fill="1F497D"/>
             <w:tcMar>
               <w:top w:w="100" w:type="dxa"/>
               <w:bottom w:w="100" w:type="dxa"/>
@@ -2883,7 +2886,7 @@
         <w:tc>
           <w:tcPr>
             <w:tcW w:type="dxa" w:w="1152"/>
-            <w:shd w:val="clear" w:color="auto" w:fill="FFFFFF"/>
+            <w:shd w:fill="FFFFFF"/>
             <w:tcMar>
               <w:top w:w="80" w:type="dxa"/>
               <w:bottom w:w="80" w:type="dxa"/>
@@ -2909,7 +2912,7 @@
         <w:tc>
           <w:tcPr>
             <w:tcW w:type="dxa" w:w="1728"/>
-            <w:shd w:val="clear" w:color="auto" w:fill="FFFFFF"/>
+            <w:shd w:fill="FFFFFF"/>
             <w:tcMar>
               <w:top w:w="80" w:type="dxa"/>
               <w:bottom w:w="80" w:type="dxa"/>
@@ -2934,7 +2937,7 @@
         <w:tc>
           <w:tcPr>
             <w:tcW w:type="dxa" w:w="2880"/>
-            <w:shd w:val="clear" w:color="auto" w:fill="FFFFFF"/>
+            <w:shd w:fill="FFFFFF"/>
             <w:tcMar>
               <w:top w:w="80" w:type="dxa"/>
               <w:bottom w:w="80" w:type="dxa"/>
@@ -2959,7 +2962,7 @@
         <w:tc>
           <w:tcPr>
             <w:tcW w:type="dxa" w:w="2880"/>
-            <w:shd w:val="clear" w:color="auto" w:fill="FFFFFF"/>
+            <w:shd w:fill="FFFFFF"/>
             <w:tcMar>
               <w:top w:w="80" w:type="dxa"/>
               <w:bottom w:w="80" w:type="dxa"/>
@@ -2977,14 +2980,14 @@
                 <w:color w:val="282828"/>
                 <w:sz w:val="17"/>
               </w:rPr>
-              <w:t>Kế thừa 16 trường nghiệp vụ &amp; số đo từ operational_measurements đạt 90%.</w:t>
+              <w:t>Kế thừa 12/16 thông số phù hợp từ Order nguồn vào Bill; không sao chép ngày hết hạn báo giá; tỷ lệ tự động đạt 90%.</w:t>
             </w:r>
           </w:p>
         </w:tc>
         <w:tc>
           <w:tcPr>
             <w:tcW w:type="dxa" w:w="720"/>
-            <w:shd w:val="clear" w:color="auto" w:fill="FFFFFF"/>
+            <w:shd w:fill="FFFFFF"/>
             <w:tcMar>
               <w:top w:w="80" w:type="dxa"/>
               <w:bottom w:w="80" w:type="dxa"/>
@@ -3012,7 +3015,7 @@
         <w:tc>
           <w:tcPr>
             <w:tcW w:type="dxa" w:w="1152"/>
-            <w:shd w:val="clear" w:color="auto" w:fill="F9FAFB"/>
+            <w:shd w:fill="F9FAFB"/>
             <w:tcMar>
               <w:top w:w="80" w:type="dxa"/>
               <w:bottom w:w="80" w:type="dxa"/>
@@ -3038,7 +3041,7 @@
         <w:tc>
           <w:tcPr>
             <w:tcW w:type="dxa" w:w="1728"/>
-            <w:shd w:val="clear" w:color="auto" w:fill="F9FAFB"/>
+            <w:shd w:fill="F9FAFB"/>
             <w:tcMar>
               <w:top w:w="80" w:type="dxa"/>
               <w:bottom w:w="80" w:type="dxa"/>
@@ -3063,7 +3066,7 @@
         <w:tc>
           <w:tcPr>
             <w:tcW w:type="dxa" w:w="2880"/>
-            <w:shd w:val="clear" w:color="auto" w:fill="F9FAFB"/>
+            <w:shd w:fill="F9FAFB"/>
             <w:tcMar>
               <w:top w:w="80" w:type="dxa"/>
               <w:bottom w:w="80" w:type="dxa"/>
@@ -3088,7 +3091,7 @@
         <w:tc>
           <w:tcPr>
             <w:tcW w:type="dxa" w:w="2880"/>
-            <w:shd w:val="clear" w:color="auto" w:fill="F9FAFB"/>
+            <w:shd w:fill="F9FAFB"/>
             <w:tcMar>
               <w:top w:w="80" w:type="dxa"/>
               <w:bottom w:w="80" w:type="dxa"/>
@@ -3106,14 +3109,14 @@
                 <w:color w:val="282828"/>
                 <w:sz w:val="17"/>
               </w:rPr>
-              <w:t>Không chọn Order đầu. customerPartyId = null, flag Conflict kèm 2 candidate.</w:t>
+              <w:t>Không tự ý chọn Customer Order đầu tiên. customerPartyId = null, flag Conflict kèm 2 candidate rõ ràng.</w:t>
             </w:r>
           </w:p>
         </w:tc>
         <w:tc>
           <w:tcPr>
             <w:tcW w:type="dxa" w:w="720"/>
-            <w:shd w:val="clear" w:color="auto" w:fill="F9FAFB"/>
+            <w:shd w:fill="F9FAFB"/>
             <w:tcMar>
               <w:top w:w="80" w:type="dxa"/>
               <w:bottom w:w="80" w:type="dxa"/>
@@ -3141,7 +3144,7 @@
         <w:tc>
           <w:tcPr>
             <w:tcW w:type="dxa" w:w="1152"/>
-            <w:shd w:val="clear" w:color="auto" w:fill="FFFFFF"/>
+            <w:shd w:fill="FFFFFF"/>
             <w:tcMar>
               <w:top w:w="80" w:type="dxa"/>
               <w:bottom w:w="80" w:type="dxa"/>
@@ -3167,7 +3170,7 @@
         <w:tc>
           <w:tcPr>
             <w:tcW w:type="dxa" w:w="1728"/>
-            <w:shd w:val="clear" w:color="auto" w:fill="FFFFFF"/>
+            <w:shd w:fill="FFFFFF"/>
             <w:tcMar>
               <w:top w:w="80" w:type="dxa"/>
               <w:bottom w:w="80" w:type="dxa"/>
@@ -3192,7 +3195,7 @@
         <w:tc>
           <w:tcPr>
             <w:tcW w:type="dxa" w:w="2880"/>
-            <w:shd w:val="clear" w:color="auto" w:fill="FFFFFF"/>
+            <w:shd w:fill="FFFFFF"/>
             <w:tcMar>
               <w:top w:w="80" w:type="dxa"/>
               <w:bottom w:w="80" w:type="dxa"/>
@@ -3217,7 +3220,7 @@
         <w:tc>
           <w:tcPr>
             <w:tcW w:type="dxa" w:w="2880"/>
-            <w:shd w:val="clear" w:color="auto" w:fill="FFFFFF"/>
+            <w:shd w:fill="FFFFFF"/>
             <w:tcMar>
               <w:top w:w="80" w:type="dxa"/>
               <w:bottom w:w="80" w:type="dxa"/>
@@ -3235,14 +3238,14 @@
                 <w:color w:val="282828"/>
                 <w:sz w:val="17"/>
               </w:rPr>
-              <w:t>Gợi ý tuyến SGN-HAN; ETD trả về null yêu cầu người dùng xác nhận riêng.</w:t>
+              <w:t>Tuyến đồng thuận SGN-HAN được gợi ý tự động; ETD khác nhau trả về null và yêu cầu người dùng xác nhận riêng.</w:t>
             </w:r>
           </w:p>
         </w:tc>
         <w:tc>
           <w:tcPr>
             <w:tcW w:type="dxa" w:w="720"/>
-            <w:shd w:val="clear" w:color="auto" w:fill="FFFFFF"/>
+            <w:shd w:fill="FFFFFF"/>
             <w:tcMar>
               <w:top w:w="80" w:type="dxa"/>
               <w:bottom w:w="80" w:type="dxa"/>
@@ -3270,7 +3273,7 @@
         <w:tc>
           <w:tcPr>
             <w:tcW w:type="dxa" w:w="1152"/>
-            <w:shd w:val="clear" w:color="auto" w:fill="F9FAFB"/>
+            <w:shd w:fill="F9FAFB"/>
             <w:tcMar>
               <w:top w:w="80" w:type="dxa"/>
               <w:bottom w:w="80" w:type="dxa"/>
@@ -3296,7 +3299,7 @@
         <w:tc>
           <w:tcPr>
             <w:tcW w:type="dxa" w:w="1728"/>
-            <w:shd w:val="clear" w:color="auto" w:fill="F9FAFB"/>
+            <w:shd w:fill="F9FAFB"/>
             <w:tcMar>
               <w:top w:w="80" w:type="dxa"/>
               <w:bottom w:w="80" w:type="dxa"/>
@@ -3321,7 +3324,7 @@
         <w:tc>
           <w:tcPr>
             <w:tcW w:type="dxa" w:w="2880"/>
-            <w:shd w:val="clear" w:color="auto" w:fill="F9FAFB"/>
+            <w:shd w:fill="F9FAFB"/>
             <w:tcMar>
               <w:top w:w="80" w:type="dxa"/>
               <w:bottom w:w="80" w:type="dxa"/>
@@ -3346,7 +3349,7 @@
         <w:tc>
           <w:tcPr>
             <w:tcW w:type="dxa" w:w="2880"/>
-            <w:shd w:val="clear" w:color="auto" w:fill="F9FAFB"/>
+            <w:shd w:fill="F9FAFB"/>
             <w:tcMar>
               <w:top w:w="80" w:type="dxa"/>
               <w:bottom w:w="80" w:type="dxa"/>
@@ -3364,14 +3367,14 @@
                 <w:color w:val="282828"/>
                 <w:sz w:val="17"/>
               </w:rPr>
-              <w:t>Khử trùng lặp SHARED_CARGO_LINE; tính lại CW theo ChargeableWeightPolicy.</w:t>
+              <w:t>Khử trùng lặp SHARED_CARGO_LINE; tính lại CW theo ChargeableWeightPolicy không nhân đôi.</w:t>
             </w:r>
           </w:p>
         </w:tc>
         <w:tc>
           <w:tcPr>
             <w:tcW w:type="dxa" w:w="720"/>
-            <w:shd w:val="clear" w:color="auto" w:fill="F9FAFB"/>
+            <w:shd w:fill="F9FAFB"/>
             <w:tcMar>
               <w:top w:w="80" w:type="dxa"/>
               <w:bottom w:w="80" w:type="dxa"/>
@@ -3399,7 +3402,7 @@
         <w:tc>
           <w:tcPr>
             <w:tcW w:type="dxa" w:w="1152"/>
-            <w:shd w:val="clear" w:color="auto" w:fill="FFFFFF"/>
+            <w:shd w:fill="FFFFFF"/>
             <w:tcMar>
               <w:top w:w="80" w:type="dxa"/>
               <w:bottom w:w="80" w:type="dxa"/>
@@ -3425,7 +3428,7 @@
         <w:tc>
           <w:tcPr>
             <w:tcW w:type="dxa" w:w="1728"/>
-            <w:shd w:val="clear" w:color="auto" w:fill="FFFFFF"/>
+            <w:shd w:fill="FFFFFF"/>
             <w:tcMar>
               <w:top w:w="80" w:type="dxa"/>
               <w:bottom w:w="80" w:type="dxa"/>
@@ -3450,7 +3453,7 @@
         <w:tc>
           <w:tcPr>
             <w:tcW w:type="dxa" w:w="2880"/>
-            <w:shd w:val="clear" w:color="auto" w:fill="FFFFFF"/>
+            <w:shd w:fill="FFFFFF"/>
             <w:tcMar>
               <w:top w:w="80" w:type="dxa"/>
               <w:bottom w:w="80" w:type="dxa"/>
@@ -3475,7 +3478,7 @@
         <w:tc>
           <w:tcPr>
             <w:tcW w:type="dxa" w:w="2880"/>
-            <w:shd w:val="clear" w:color="auto" w:fill="FFFFFF"/>
+            <w:shd w:fill="FFFFFF"/>
             <w:tcMar>
               <w:top w:w="80" w:type="dxa"/>
               <w:bottom w:w="80" w:type="dxa"/>
@@ -3493,14 +3496,14 @@
                 <w:color w:val="282828"/>
                 <w:sz w:val="17"/>
               </w:rPr>
-              <w:t>Bảo lưu giá trị ghi đè trong preservedUserOverrides, không bị ghi đè lại.</w:t>
+              <w:t>Bảo lưu giá trị ghi đè trong preservedUserOverrides, không bị xóa khi tính toán lại.</w:t>
             </w:r>
           </w:p>
         </w:tc>
         <w:tc>
           <w:tcPr>
             <w:tcW w:type="dxa" w:w="720"/>
-            <w:shd w:val="clear" w:color="auto" w:fill="FFFFFF"/>
+            <w:shd w:fill="FFFFFF"/>
             <w:tcMar>
               <w:top w:w="80" w:type="dxa"/>
               <w:bottom w:w="80" w:type="dxa"/>
@@ -3528,7 +3531,7 @@
         <w:tc>
           <w:tcPr>
             <w:tcW w:type="dxa" w:w="1152"/>
-            <w:shd w:val="clear" w:color="auto" w:fill="F9FAFB"/>
+            <w:shd w:fill="F9FAFB"/>
             <w:tcMar>
               <w:top w:w="80" w:type="dxa"/>
               <w:bottom w:w="80" w:type="dxa"/>
@@ -3554,7 +3557,7 @@
         <w:tc>
           <w:tcPr>
             <w:tcW w:type="dxa" w:w="1728"/>
-            <w:shd w:val="clear" w:color="auto" w:fill="F9FAFB"/>
+            <w:shd w:fill="F9FAFB"/>
             <w:tcMar>
               <w:top w:w="80" w:type="dxa"/>
               <w:bottom w:w="80" w:type="dxa"/>
@@ -3579,7 +3582,7 @@
         <w:tc>
           <w:tcPr>
             <w:tcW w:type="dxa" w:w="2880"/>
-            <w:shd w:val="clear" w:color="auto" w:fill="F9FAFB"/>
+            <w:shd w:fill="F9FAFB"/>
             <w:tcMar>
               <w:top w:w="80" w:type="dxa"/>
               <w:bottom w:w="80" w:type="dxa"/>
@@ -3604,7 +3607,7 @@
         <w:tc>
           <w:tcPr>
             <w:tcW w:type="dxa" w:w="2880"/>
-            <w:shd w:val="clear" w:color="auto" w:fill="F9FAFB"/>
+            <w:shd w:fill="F9FAFB"/>
             <w:tcMar>
               <w:top w:w="80" w:type="dxa"/>
               <w:bottom w:w="80" w:type="dxa"/>
@@ -3622,14 +3625,14 @@
                 <w:color w:val="282828"/>
                 <w:sz w:val="17"/>
               </w:rPr>
-              <w:t>Chặn sửa đổi tùy tiện khi không có lý do điều chỉnh vận hành hợp lệ.</w:t>
+              <w:t>Chặn sửa đổi tùy tiện trường vận hành khi không có lý do điều chỉnh vận hành hợp lệ.</w:t>
             </w:r>
           </w:p>
         </w:tc>
         <w:tc>
           <w:tcPr>
             <w:tcW w:type="dxa" w:w="720"/>
-            <w:shd w:val="clear" w:color="auto" w:fill="F9FAFB"/>
+            <w:shd w:fill="F9FAFB"/>
             <w:tcMar>
               <w:top w:w="80" w:type="dxa"/>
               <w:bottom w:w="80" w:type="dxa"/>
@@ -3657,7 +3660,7 @@
         <w:tc>
           <w:tcPr>
             <w:tcW w:type="dxa" w:w="1152"/>
-            <w:shd w:val="clear" w:color="auto" w:fill="FFFFFF"/>
+            <w:shd w:fill="FFFFFF"/>
             <w:tcMar>
               <w:top w:w="80" w:type="dxa"/>
               <w:bottom w:w="80" w:type="dxa"/>
@@ -3683,7 +3686,7 @@
         <w:tc>
           <w:tcPr>
             <w:tcW w:type="dxa" w:w="1728"/>
-            <w:shd w:val="clear" w:color="auto" w:fill="FFFFFF"/>
+            <w:shd w:fill="FFFFFF"/>
             <w:tcMar>
               <w:top w:w="80" w:type="dxa"/>
               <w:bottom w:w="80" w:type="dxa"/>
@@ -3708,7 +3711,7 @@
         <w:tc>
           <w:tcPr>
             <w:tcW w:type="dxa" w:w="2880"/>
-            <w:shd w:val="clear" w:color="auto" w:fill="FFFFFF"/>
+            <w:shd w:fill="FFFFFF"/>
             <w:tcMar>
               <w:top w:w="80" w:type="dxa"/>
               <w:bottom w:w="80" w:type="dxa"/>
@@ -3733,7 +3736,7 @@
         <w:tc>
           <w:tcPr>
             <w:tcW w:type="dxa" w:w="2880"/>
-            <w:shd w:val="clear" w:color="auto" w:fill="FFFFFF"/>
+            <w:shd w:fill="FFFFFF"/>
             <w:tcMar>
               <w:top w:w="80" w:type="dxa"/>
               <w:bottom w:w="80" w:type="dxa"/>
@@ -3751,14 +3754,14 @@
                 <w:color w:val="282828"/>
                 <w:sz w:val="17"/>
               </w:rPr>
-              <w:t>Rollup chính xác 50 kiện (50%), 500 kg và 2.5 CBM theo tỷ lệ phân bổ.</w:t>
+              <w:t>Rollup chính xác 50 kiện (50%), 500 kg và 2.5 CBM theo tỷ lệ phân bổ của Bill vào Shipment.</w:t>
             </w:r>
           </w:p>
         </w:tc>
         <w:tc>
           <w:tcPr>
             <w:tcW w:type="dxa" w:w="720"/>
-            <w:shd w:val="clear" w:color="auto" w:fill="FFFFFF"/>
+            <w:shd w:fill="FFFFFF"/>
             <w:tcMar>
               <w:top w:w="80" w:type="dxa"/>
               <w:bottom w:w="80" w:type="dxa"/>
@@ -3786,7 +3789,7 @@
         <w:tc>
           <w:tcPr>
             <w:tcW w:type="dxa" w:w="1152"/>
-            <w:shd w:val="clear" w:color="auto" w:fill="F9FAFB"/>
+            <w:shd w:fill="F9FAFB"/>
             <w:tcMar>
               <w:top w:w="80" w:type="dxa"/>
               <w:bottom w:w="80" w:type="dxa"/>
@@ -3812,7 +3815,7 @@
         <w:tc>
           <w:tcPr>
             <w:tcW w:type="dxa" w:w="1728"/>
-            <w:shd w:val="clear" w:color="auto" w:fill="F9FAFB"/>
+            <w:shd w:fill="F9FAFB"/>
             <w:tcMar>
               <w:top w:w="80" w:type="dxa"/>
               <w:bottom w:w="80" w:type="dxa"/>
@@ -3837,7 +3840,7 @@
         <w:tc>
           <w:tcPr>
             <w:tcW w:type="dxa" w:w="2880"/>
-            <w:shd w:val="clear" w:color="auto" w:fill="F9FAFB"/>
+            <w:shd w:fill="F9FAFB"/>
             <w:tcMar>
               <w:top w:w="80" w:type="dxa"/>
               <w:bottom w:w="80" w:type="dxa"/>
@@ -3862,7 +3865,7 @@
         <w:tc>
           <w:tcPr>
             <w:tcW w:type="dxa" w:w="2880"/>
-            <w:shd w:val="clear" w:color="auto" w:fill="F9FAFB"/>
+            <w:shd w:fill="F9FAFB"/>
             <w:tcMar>
               <w:top w:w="80" w:type="dxa"/>
               <w:bottom w:w="80" w:type="dxa"/>
@@ -3880,14 +3883,14 @@
                 <w:color w:val="282828"/>
                 <w:sz w:val="17"/>
               </w:rPr>
-              <w:t>Phát hiện vận tải kết hợp Road + Air, tự động gợi ý multimodal.</w:t>
+              <w:t>Phát hiện vận tải kết hợp Road + Air, tự động gợi ý transportMode = multimodal.</w:t>
             </w:r>
           </w:p>
         </w:tc>
         <w:tc>
           <w:tcPr>
             <w:tcW w:type="dxa" w:w="720"/>
-            <w:shd w:val="clear" w:color="auto" w:fill="F9FAFB"/>
+            <w:shd w:fill="F9FAFB"/>
             <w:tcMar>
               <w:top w:w="80" w:type="dxa"/>
               <w:bottom w:w="80" w:type="dxa"/>
@@ -3915,7 +3918,7 @@
         <w:tc>
           <w:tcPr>
             <w:tcW w:type="dxa" w:w="1152"/>
-            <w:shd w:val="clear" w:color="auto" w:fill="FFFFFF"/>
+            <w:shd w:fill="FFFFFF"/>
             <w:tcMar>
               <w:top w:w="80" w:type="dxa"/>
               <w:bottom w:w="80" w:type="dxa"/>
@@ -3941,7 +3944,7 @@
         <w:tc>
           <w:tcPr>
             <w:tcW w:type="dxa" w:w="1728"/>
-            <w:shd w:val="clear" w:color="auto" w:fill="FFFFFF"/>
+            <w:shd w:fill="FFFFFF"/>
             <w:tcMar>
               <w:top w:w="80" w:type="dxa"/>
               <w:bottom w:w="80" w:type="dxa"/>
@@ -3966,7 +3969,7 @@
         <w:tc>
           <w:tcPr>
             <w:tcW w:type="dxa" w:w="2880"/>
-            <w:shd w:val="clear" w:color="auto" w:fill="FFFFFF"/>
+            <w:shd w:fill="FFFFFF"/>
             <w:tcMar>
               <w:top w:w="80" w:type="dxa"/>
               <w:bottom w:w="80" w:type="dxa"/>
@@ -3991,7 +3994,7 @@
         <w:tc>
           <w:tcPr>
             <w:tcW w:type="dxa" w:w="2880"/>
-            <w:shd w:val="clear" w:color="auto" w:fill="FFFFFF"/>
+            <w:shd w:fill="FFFFFF"/>
             <w:tcMar>
               <w:top w:w="80" w:type="dxa"/>
               <w:bottom w:w="80" w:type="dxa"/>
@@ -4009,14 +4012,14 @@
                 <w:color w:val="282828"/>
                 <w:sz w:val="17"/>
               </w:rPr>
-              <w:t>Phát hiện xung đột tuyến ngược chiều; chặn tự động gán tuyến ngẫu nhiên.</w:t>
+              <w:t>Phát hiện xung đột tuyến ngược hướng SGN-LAX và LAX-SGN; chặn không tự động gán tuyến ngẫu nhiên.</w:t>
             </w:r>
           </w:p>
         </w:tc>
         <w:tc>
           <w:tcPr>
             <w:tcW w:type="dxa" w:w="720"/>
-            <w:shd w:val="clear" w:color="auto" w:fill="FFFFFF"/>
+            <w:shd w:fill="FFFFFF"/>
             <w:tcMar>
               <w:top w:w="80" w:type="dxa"/>
               <w:bottom w:w="80" w:type="dxa"/>
@@ -4044,7 +4047,7 @@
         <w:tc>
           <w:tcPr>
             <w:tcW w:type="dxa" w:w="1152"/>
-            <w:shd w:val="clear" w:color="auto" w:fill="F9FAFB"/>
+            <w:shd w:fill="F9FAFB"/>
             <w:tcMar>
               <w:top w:w="80" w:type="dxa"/>
               <w:bottom w:w="80" w:type="dxa"/>
@@ -4070,7 +4073,7 @@
         <w:tc>
           <w:tcPr>
             <w:tcW w:type="dxa" w:w="1728"/>
-            <w:shd w:val="clear" w:color="auto" w:fill="F9FAFB"/>
+            <w:shd w:fill="F9FAFB"/>
             <w:tcMar>
               <w:top w:w="80" w:type="dxa"/>
               <w:bottom w:w="80" w:type="dxa"/>
@@ -4095,7 +4098,7 @@
         <w:tc>
           <w:tcPr>
             <w:tcW w:type="dxa" w:w="2880"/>
-            <w:shd w:val="clear" w:color="auto" w:fill="F9FAFB"/>
+            <w:shd w:fill="F9FAFB"/>
             <w:tcMar>
               <w:top w:w="80" w:type="dxa"/>
               <w:bottom w:w="80" w:type="dxa"/>
@@ -4120,7 +4123,7 @@
         <w:tc>
           <w:tcPr>
             <w:tcW w:type="dxa" w:w="2880"/>
-            <w:shd w:val="clear" w:color="auto" w:fill="F9FAFB"/>
+            <w:shd w:fill="F9FAFB"/>
             <w:tcMar>
               <w:top w:w="80" w:type="dxa"/>
               <w:bottom w:w="80" w:type="dxa"/>
@@ -4138,14 +4141,14 @@
                 <w:color w:val="282828"/>
                 <w:sz w:val="17"/>
               </w:rPr>
-              <w:t>Gợi ý commodityTypeId = null, bật cờ hàng hỗn hợp IsMixedCommodity = true.</w:t>
+              <w:t>Các Bill có chủng loại hàng khác nhau -&gt; gợi ý commodityTypeId = null, bật cờ hàng hỗn hợp isMixedCommodity = true.</w:t>
             </w:r>
           </w:p>
         </w:tc>
         <w:tc>
           <w:tcPr>
             <w:tcW w:type="dxa" w:w="720"/>
-            <w:shd w:val="clear" w:color="auto" w:fill="F9FAFB"/>
+            <w:shd w:fill="F9FAFB"/>
             <w:tcMar>
               <w:top w:w="80" w:type="dxa"/>
               <w:bottom w:w="80" w:type="dxa"/>
@@ -4173,7 +4176,7 @@
         <w:tc>
           <w:tcPr>
             <w:tcW w:type="dxa" w:w="1152"/>
-            <w:shd w:val="clear" w:color="auto" w:fill="FFFFFF"/>
+            <w:shd w:fill="FFFFFF"/>
             <w:tcMar>
               <w:top w:w="80" w:type="dxa"/>
               <w:bottom w:w="80" w:type="dxa"/>
@@ -4199,7 +4202,7 @@
         <w:tc>
           <w:tcPr>
             <w:tcW w:type="dxa" w:w="1728"/>
-            <w:shd w:val="clear" w:color="auto" w:fill="FFFFFF"/>
+            <w:shd w:fill="FFFFFF"/>
             <w:tcMar>
               <w:top w:w="80" w:type="dxa"/>
               <w:bottom w:w="80" w:type="dxa"/>
@@ -4224,7 +4227,7 @@
         <w:tc>
           <w:tcPr>
             <w:tcW w:type="dxa" w:w="2880"/>
-            <w:shd w:val="clear" w:color="auto" w:fill="FFFFFF"/>
+            <w:shd w:fill="FFFFFF"/>
             <w:tcMar>
               <w:top w:w="80" w:type="dxa"/>
               <w:bottom w:w="80" w:type="dxa"/>
@@ -4249,7 +4252,7 @@
         <w:tc>
           <w:tcPr>
             <w:tcW w:type="dxa" w:w="2880"/>
-            <w:shd w:val="clear" w:color="auto" w:fill="FFFFFF"/>
+            <w:shd w:fill="FFFFFF"/>
             <w:tcMar>
               <w:top w:w="80" w:type="dxa"/>
               <w:bottom w:w="80" w:type="dxa"/>
@@ -4267,14 +4270,14 @@
                 <w:color w:val="282828"/>
                 <w:sz w:val="17"/>
               </w:rPr>
-              <w:t>Chặng 2 để ngỏ Cảng đến (destination = null) để điều phối linh hoạt.</w:t>
+              <w:t>Chặng giữa 2 trong chuỗi 3 chặng để ngỏ Cảng đến (destination = null) để điều phối linh hoạt; không áp ép đích cuối.</w:t>
             </w:r>
           </w:p>
         </w:tc>
         <w:tc>
           <w:tcPr>
             <w:tcW w:type="dxa" w:w="720"/>
-            <w:shd w:val="clear" w:color="auto" w:fill="FFFFFF"/>
+            <w:shd w:fill="FFFFFF"/>
             <w:tcMar>
               <w:top w:w="80" w:type="dxa"/>
               <w:bottom w:w="80" w:type="dxa"/>
@@ -4302,7 +4305,7 @@
         <w:tc>
           <w:tcPr>
             <w:tcW w:type="dxa" w:w="1152"/>
-            <w:shd w:val="clear" w:color="auto" w:fill="F9FAFB"/>
+            <w:shd w:fill="F9FAFB"/>
             <w:tcMar>
               <w:top w:w="80" w:type="dxa"/>
               <w:bottom w:w="80" w:type="dxa"/>
@@ -4328,7 +4331,7 @@
         <w:tc>
           <w:tcPr>
             <w:tcW w:type="dxa" w:w="1728"/>
-            <w:shd w:val="clear" w:color="auto" w:fill="F9FAFB"/>
+            <w:shd w:fill="F9FAFB"/>
             <w:tcMar>
               <w:top w:w="80" w:type="dxa"/>
               <w:bottom w:w="80" w:type="dxa"/>
@@ -4353,7 +4356,7 @@
         <w:tc>
           <w:tcPr>
             <w:tcW w:type="dxa" w:w="2880"/>
-            <w:shd w:val="clear" w:color="auto" w:fill="F9FAFB"/>
+            <w:shd w:fill="F9FAFB"/>
             <w:tcMar>
               <w:top w:w="80" w:type="dxa"/>
               <w:bottom w:w="80" w:type="dxa"/>
@@ -4371,14 +4374,14 @@
                 <w:color w:val="282828"/>
                 <w:sz w:val="17"/>
               </w:rPr>
-              <w:t>Tạo 2 Movement liên tiếp</w:t>
+              <w:t>Một Chuyến vận tải 2 Leg cùng hành trình</w:t>
             </w:r>
           </w:p>
         </w:tc>
         <w:tc>
           <w:tcPr>
             <w:tcW w:type="dxa" w:w="2880"/>
-            <w:shd w:val="clear" w:color="auto" w:fill="F9FAFB"/>
+            <w:shd w:fill="F9FAFB"/>
             <w:tcMar>
               <w:top w:w="80" w:type="dxa"/>
               <w:bottom w:w="80" w:type="dxa"/>
@@ -4396,14 +4399,14 @@
                 <w:color w:val="282828"/>
                 <w:sz w:val="17"/>
               </w:rPr>
-              <w:t>Movement thứ hai bắt buộc nhập địa điểm thực tế; không tự gán bừa.</w:t>
+              <w:t>Chọn 2 Leg cùng hành trình -&gt; API trả về gợi ý đồng nhất, liên kết thành công vào 1 Chuyến duy nhất (MVT-UT12), không tạo chuyến trùng.</w:t>
             </w:r>
           </w:p>
         </w:tc>
         <w:tc>
           <w:tcPr>
             <w:tcW w:type="dxa" w:w="720"/>
-            <w:shd w:val="clear" w:color="auto" w:fill="F9FAFB"/>
+            <w:shd w:fill="F9FAFB"/>
             <w:tcMar>
               <w:top w:w="80" w:type="dxa"/>
               <w:bottom w:w="80" w:type="dxa"/>
@@ -4431,7 +4434,7 @@
         <w:tc>
           <w:tcPr>
             <w:tcW w:type="dxa" w:w="1152"/>
-            <w:shd w:val="clear" w:color="auto" w:fill="FFFFFF"/>
+            <w:shd w:fill="FFFFFF"/>
             <w:tcMar>
               <w:top w:w="80" w:type="dxa"/>
               <w:bottom w:w="80" w:type="dxa"/>
@@ -4457,7 +4460,7 @@
         <w:tc>
           <w:tcPr>
             <w:tcW w:type="dxa" w:w="1728"/>
-            <w:shd w:val="clear" w:color="auto" w:fill="FFFFFF"/>
+            <w:shd w:fill="FFFFFF"/>
             <w:tcMar>
               <w:top w:w="80" w:type="dxa"/>
               <w:bottom w:w="80" w:type="dxa"/>
@@ -4482,7 +4485,7 @@
         <w:tc>
           <w:tcPr>
             <w:tcW w:type="dxa" w:w="2880"/>
-            <w:shd w:val="clear" w:color="auto" w:fill="FFFFFF"/>
+            <w:shd w:fill="FFFFFF"/>
             <w:tcMar>
               <w:top w:w="80" w:type="dxa"/>
               <w:bottom w:w="80" w:type="dxa"/>
@@ -4507,7 +4510,7 @@
         <w:tc>
           <w:tcPr>
             <w:tcW w:type="dxa" w:w="2880"/>
-            <w:shd w:val="clear" w:color="auto" w:fill="FFFFFF"/>
+            <w:shd w:fill="FFFFFF"/>
             <w:tcMar>
               <w:top w:w="80" w:type="dxa"/>
               <w:bottom w:w="80" w:type="dxa"/>
@@ -4525,14 +4528,14 @@
                 <w:color w:val="282828"/>
                 <w:sz w:val="17"/>
               </w:rPr>
-              <w:t>Chặn tạo chuyến: Leg Air vs Movement Sea ném lỗi ValidationAppException.</w:t>
+              <w:t>Chặn gom các chặng có phương thức vật lý khác nhau (Air vs Road) vào cùng một Chuyến (ném ValidationAppException 400).</w:t>
             </w:r>
           </w:p>
         </w:tc>
         <w:tc>
           <w:tcPr>
             <w:tcW w:type="dxa" w:w="720"/>
-            <w:shd w:val="clear" w:color="auto" w:fill="FFFFFF"/>
+            <w:shd w:fill="FFFFFF"/>
             <w:tcMar>
               <w:top w:w="80" w:type="dxa"/>
               <w:bottom w:w="80" w:type="dxa"/>
@@ -4560,7 +4563,7 @@
         <w:tc>
           <w:tcPr>
             <w:tcW w:type="dxa" w:w="1152"/>
-            <w:shd w:val="clear" w:color="auto" w:fill="F9FAFB"/>
+            <w:shd w:fill="F9FAFB"/>
             <w:tcMar>
               <w:top w:w="80" w:type="dxa"/>
               <w:bottom w:w="80" w:type="dxa"/>
@@ -4586,7 +4589,7 @@
         <w:tc>
           <w:tcPr>
             <w:tcW w:type="dxa" w:w="1728"/>
-            <w:shd w:val="clear" w:color="auto" w:fill="F9FAFB"/>
+            <w:shd w:fill="F9FAFB"/>
             <w:tcMar>
               <w:top w:w="80" w:type="dxa"/>
               <w:bottom w:w="80" w:type="dxa"/>
@@ -4611,7 +4614,7 @@
         <w:tc>
           <w:tcPr>
             <w:tcW w:type="dxa" w:w="2880"/>
-            <w:shd w:val="clear" w:color="auto" w:fill="F9FAFB"/>
+            <w:shd w:fill="F9FAFB"/>
             <w:tcMar>
               <w:top w:w="80" w:type="dxa"/>
               <w:bottom w:w="80" w:type="dxa"/>
@@ -4636,7 +4639,7 @@
         <w:tc>
           <w:tcPr>
             <w:tcW w:type="dxa" w:w="2880"/>
-            <w:shd w:val="clear" w:color="auto" w:fill="F9FAFB"/>
+            <w:shd w:fill="F9FAFB"/>
             <w:tcMar>
               <w:top w:w="80" w:type="dxa"/>
               <w:bottom w:w="80" w:type="dxa"/>
@@ -4654,14 +4657,14 @@
                 <w:color w:val="282828"/>
                 <w:sz w:val="17"/>
               </w:rPr>
-              <w:t>Chặn tính giá (HTTP 409 Conflict); cấm mượn trọng lượng tổng của Bill.</w:t>
+              <w:t>Chặn tính giá theo Chặng khi thiếu trọng lượng Chặng (HTTP 409 Conflict); cấm tuyệt đối việc mượn trọng lượng tổng của Bill.</w:t>
             </w:r>
           </w:p>
         </w:tc>
         <w:tc>
           <w:tcPr>
             <w:tcW w:type="dxa" w:w="720"/>
-            <w:shd w:val="clear" w:color="auto" w:fill="F9FAFB"/>
+            <w:shd w:fill="F9FAFB"/>
             <w:tcMar>
               <w:top w:w="80" w:type="dxa"/>
               <w:bottom w:w="80" w:type="dxa"/>
@@ -4689,7 +4692,7 @@
         <w:tc>
           <w:tcPr>
             <w:tcW w:type="dxa" w:w="1152"/>
-            <w:shd w:val="clear" w:color="auto" w:fill="FFFFFF"/>
+            <w:shd w:fill="FFFFFF"/>
             <w:tcMar>
               <w:top w:w="80" w:type="dxa"/>
               <w:bottom w:w="80" w:type="dxa"/>
@@ -4715,7 +4718,7 @@
         <w:tc>
           <w:tcPr>
             <w:tcW w:type="dxa" w:w="1728"/>
-            <w:shd w:val="clear" w:color="auto" w:fill="FFFFFF"/>
+            <w:shd w:fill="FFFFFF"/>
             <w:tcMar>
               <w:top w:w="80" w:type="dxa"/>
               <w:bottom w:w="80" w:type="dxa"/>
@@ -4740,7 +4743,7 @@
         <w:tc>
           <w:tcPr>
             <w:tcW w:type="dxa" w:w="2880"/>
-            <w:shd w:val="clear" w:color="auto" w:fill="FFFFFF"/>
+            <w:shd w:fill="FFFFFF"/>
             <w:tcMar>
               <w:top w:w="80" w:type="dxa"/>
               <w:bottom w:w="80" w:type="dxa"/>
@@ -4765,7 +4768,7 @@
         <w:tc>
           <w:tcPr>
             <w:tcW w:type="dxa" w:w="2880"/>
-            <w:shd w:val="clear" w:color="auto" w:fill="FFFFFF"/>
+            <w:shd w:fill="FFFFFF"/>
             <w:tcMar>
               <w:top w:w="80" w:type="dxa"/>
               <w:bottom w:w="80" w:type="dxa"/>
@@ -4784,14 +4787,14 @@
                 <w:color w:val="0AAE7B"/>
                 <w:sz w:val="17"/>
               </w:rPr>
-              <w:t>Bản snapshot giá cũ giữ nguyên bất biến, không bị ảnh hưởng (100%).</w:t>
+              <w:t>Sửa trọng lượng Bill sau khi tính giá không làm thay đổi bản snapshot giá cũ đã lưu (tính bất biến bảo đảm 100%).</w:t>
             </w:r>
           </w:p>
         </w:tc>
         <w:tc>
           <w:tcPr>
             <w:tcW w:type="dxa" w:w="720"/>
-            <w:shd w:val="clear" w:color="auto" w:fill="FFFFFF"/>
+            <w:shd w:fill="FFFFFF"/>
             <w:tcMar>
               <w:top w:w="80" w:type="dxa"/>
               <w:bottom w:w="80" w:type="dxa"/>
@@ -4819,7 +4822,7 @@
         <w:tc>
           <w:tcPr>
             <w:tcW w:type="dxa" w:w="1152"/>
-            <w:shd w:val="clear" w:color="auto" w:fill="F9FAFB"/>
+            <w:shd w:fill="F9FAFB"/>
             <w:tcMar>
               <w:top w:w="80" w:type="dxa"/>
               <w:bottom w:w="80" w:type="dxa"/>
@@ -4845,7 +4848,7 @@
         <w:tc>
           <w:tcPr>
             <w:tcW w:type="dxa" w:w="1728"/>
-            <w:shd w:val="clear" w:color="auto" w:fill="F9FAFB"/>
+            <w:shd w:fill="F9FAFB"/>
             <w:tcMar>
               <w:top w:w="80" w:type="dxa"/>
               <w:bottom w:w="80" w:type="dxa"/>
@@ -4863,14 +4866,14 @@
                 <w:color w:val="282828"/>
                 <w:sz w:val="17"/>
               </w:rPr>
-              <w:t>Surcharge</w:t>
+              <w:t>Rate Card</w:t>
             </w:r>
           </w:p>
         </w:tc>
         <w:tc>
           <w:tcPr>
             <w:tcW w:type="dxa" w:w="2880"/>
-            <w:shd w:val="clear" w:color="auto" w:fill="F9FAFB"/>
+            <w:shd w:fill="F9FAFB"/>
             <w:tcMar>
               <w:top w:w="80" w:type="dxa"/>
               <w:bottom w:w="80" w:type="dxa"/>
@@ -4888,14 +4891,14 @@
                 <w:color w:val="282828"/>
                 <w:sz w:val="17"/>
               </w:rPr>
-              <w:t>Phụ phí đa tuyến trên Bill</w:t>
+              <w:t>Một Rate Card nhiều tuyến</w:t>
             </w:r>
           </w:p>
         </w:tc>
         <w:tc>
           <w:tcPr>
             <w:tcW w:type="dxa" w:w="2880"/>
-            <w:shd w:val="clear" w:color="auto" w:fill="F9FAFB"/>
+            <w:shd w:fill="F9FAFB"/>
             <w:tcMar>
               <w:top w:w="80" w:type="dxa"/>
               <w:bottom w:w="80" w:type="dxa"/>
@@ -4913,14 +4916,14 @@
                 <w:color w:val="282828"/>
                 <w:sz w:val="17"/>
               </w:rPr>
-              <w:t>Bill 2 tuyến thì phụ phí để ngỏ RouteCode; không gán ép tuyến đầu.</w:t>
+              <w:t>Rate Card đa tuyến -&gt; Khai phụ phí liên kết để routeCode = null, cho phép người dùng tự do chọn scope áp dụng.</w:t>
             </w:r>
           </w:p>
         </w:tc>
         <w:tc>
           <w:tcPr>
             <w:tcW w:type="dxa" w:w="720"/>
-            <w:shd w:val="clear" w:color="auto" w:fill="F9FAFB"/>
+            <w:shd w:fill="F9FAFB"/>
             <w:tcMar>
               <w:top w:w="80" w:type="dxa"/>
               <w:bottom w:w="80" w:type="dxa"/>
@@ -4948,7 +4951,7 @@
         <w:tc>
           <w:tcPr>
             <w:tcW w:type="dxa" w:w="1152"/>
-            <w:shd w:val="clear" w:color="auto" w:fill="FFFFFF"/>
+            <w:shd w:fill="FFFFFF"/>
             <w:tcMar>
               <w:top w:w="80" w:type="dxa"/>
               <w:bottom w:w="80" w:type="dxa"/>
@@ -4974,7 +4977,7 @@
         <w:tc>
           <w:tcPr>
             <w:tcW w:type="dxa" w:w="1728"/>
-            <w:shd w:val="clear" w:color="auto" w:fill="FFFFFF"/>
+            <w:shd w:fill="FFFFFF"/>
             <w:tcMar>
               <w:top w:w="80" w:type="dxa"/>
               <w:bottom w:w="80" w:type="dxa"/>
@@ -4992,14 +4995,14 @@
                 <w:color w:val="282828"/>
                 <w:sz w:val="17"/>
               </w:rPr>
-              <w:t>Surcharge</w:t>
+              <w:t>Phụ phí</w:t>
             </w:r>
           </w:p>
         </w:tc>
         <w:tc>
           <w:tcPr>
             <w:tcW w:type="dxa" w:w="2880"/>
-            <w:shd w:val="clear" w:color="auto" w:fill="FFFFFF"/>
+            <w:shd w:fill="FFFFFF"/>
             <w:tcMar>
               <w:top w:w="80" w:type="dxa"/>
               <w:bottom w:w="80" w:type="dxa"/>
@@ -5017,14 +5020,14 @@
                 <w:color w:val="282828"/>
                 <w:sz w:val="17"/>
               </w:rPr>
-              <w:t>Phát hành phiên bản phụ phí mới</w:t>
+              <w:t>Phụ phí độc lập không gắn Rate Card</w:t>
             </w:r>
           </w:p>
         </w:tc>
         <w:tc>
           <w:tcPr>
             <w:tcW w:type="dxa" w:w="2880"/>
-            <w:shd w:val="clear" w:color="auto" w:fill="FFFFFF"/>
+            <w:shd w:fill="FFFFFF"/>
             <w:tcMar>
               <w:top w:w="80" w:type="dxa"/>
               <w:bottom w:w="80" w:type="dxa"/>
@@ -5042,14 +5045,14 @@
                 <w:color w:val="282828"/>
                 <w:sz w:val="17"/>
               </w:rPr>
-              <w:t>Bản snapshot phụ phí của các lần tính giá lịch sử giữ nguyên bất biến.</w:t>
+              <w:t>Phụ phí độc lập (RateCardId = null) được tạo mới thành công, tự do chọn chiều BUY/SELL, tiền tệ USD và cách tính không bị header ép buộc.</w:t>
             </w:r>
           </w:p>
         </w:tc>
         <w:tc>
           <w:tcPr>
             <w:tcW w:type="dxa" w:w="720"/>
-            <w:shd w:val="clear" w:color="auto" w:fill="FFFFFF"/>
+            <w:shd w:fill="FFFFFF"/>
             <w:tcMar>
               <w:top w:w="80" w:type="dxa"/>
               <w:bottom w:w="80" w:type="dxa"/>
@@ -5077,7 +5080,7 @@
         <w:tc>
           <w:tcPr>
             <w:tcW w:type="dxa" w:w="1152"/>
-            <w:shd w:val="clear" w:color="auto" w:fill="F9FAFB"/>
+            <w:shd w:fill="F9FAFB"/>
             <w:tcMar>
               <w:top w:w="80" w:type="dxa"/>
               <w:bottom w:w="80" w:type="dxa"/>
@@ -5103,7 +5106,7 @@
         <w:tc>
           <w:tcPr>
             <w:tcW w:type="dxa" w:w="1728"/>
-            <w:shd w:val="clear" w:color="auto" w:fill="F9FAFB"/>
+            <w:shd w:fill="F9FAFB"/>
             <w:tcMar>
               <w:top w:w="80" w:type="dxa"/>
               <w:bottom w:w="80" w:type="dxa"/>
@@ -5121,14 +5124,14 @@
                 <w:color w:val="282828"/>
                 <w:sz w:val="17"/>
               </w:rPr>
-              <w:t>Master Data</w:t>
+              <w:t>Danh mục</w:t>
             </w:r>
           </w:p>
         </w:tc>
         <w:tc>
           <w:tcPr>
             <w:tcW w:type="dxa" w:w="2880"/>
-            <w:shd w:val="clear" w:color="auto" w:fill="F9FAFB"/>
+            <w:shd w:fill="F9FAFB"/>
             <w:tcMar>
               <w:top w:w="80" w:type="dxa"/>
               <w:bottom w:w="80" w:type="dxa"/>
@@ -5146,14 +5149,14 @@
                 <w:color w:val="282828"/>
                 <w:sz w:val="17"/>
               </w:rPr>
-              <w:t>Bảng giá hết hiệu lực (Inactive)</w:t>
+              <w:t>Master Dịch vụ không có giá trị active</w:t>
             </w:r>
           </w:p>
         </w:tc>
         <w:tc>
           <w:tcPr>
             <w:tcW w:type="dxa" w:w="2880"/>
-            <w:shd w:val="clear" w:color="auto" w:fill="F9FAFB"/>
+            <w:shd w:fill="F9FAFB"/>
             <w:tcMar>
               <w:top w:w="80" w:type="dxa"/>
               <w:bottom w:w="80" w:type="dxa"/>
@@ -5171,14 +5174,14 @@
                 <w:color w:val="282828"/>
                 <w:sz w:val="17"/>
               </w:rPr>
-              <w:t>Chặn áp dụng tính giá bảng giá inactive trên Bill (HTTP 409).</w:t>
+              <w:t>Khi danh mục Master Dịch vụ chưa có giá trị active, API trả về dropdown rỗng; gửi mã tự do bị chặn bằng HTTP 400 ValidationAppException.</w:t>
             </w:r>
           </w:p>
         </w:tc>
         <w:tc>
           <w:tcPr>
             <w:tcW w:type="dxa" w:w="720"/>
-            <w:shd w:val="clear" w:color="auto" w:fill="F9FAFB"/>
+            <w:shd w:fill="F9FAFB"/>
             <w:tcMar>
               <w:top w:w="80" w:type="dxa"/>
               <w:bottom w:w="80" w:type="dxa"/>
@@ -5206,7 +5209,7 @@
         <w:tc>
           <w:tcPr>
             <w:tcW w:type="dxa" w:w="1152"/>
-            <w:shd w:val="clear" w:color="auto" w:fill="FFFFFF"/>
+            <w:shd w:fill="FFFFFF"/>
             <w:tcMar>
               <w:top w:w="80" w:type="dxa"/>
               <w:bottom w:w="80" w:type="dxa"/>
@@ -5232,7 +5235,7 @@
         <w:tc>
           <w:tcPr>
             <w:tcW w:type="dxa" w:w="1728"/>
-            <w:shd w:val="clear" w:color="auto" w:fill="FFFFFF"/>
+            <w:shd w:fill="FFFFFF"/>
             <w:tcMar>
               <w:top w:w="80" w:type="dxa"/>
               <w:bottom w:w="80" w:type="dxa"/>
@@ -5257,7 +5260,7 @@
         <w:tc>
           <w:tcPr>
             <w:tcW w:type="dxa" w:w="2880"/>
-            <w:shd w:val="clear" w:color="auto" w:fill="FFFFFF"/>
+            <w:shd w:fill="FFFFFF"/>
             <w:tcMar>
               <w:top w:w="80" w:type="dxa"/>
               <w:bottom w:w="80" w:type="dxa"/>
@@ -5282,7 +5285,7 @@
         <w:tc>
           <w:tcPr>
             <w:tcW w:type="dxa" w:w="2880"/>
-            <w:shd w:val="clear" w:color="auto" w:fill="FFFFFF"/>
+            <w:shd w:fill="FFFFFF"/>
             <w:tcMar>
               <w:top w:w="80" w:type="dxa"/>
               <w:bottom w:w="80" w:type="dxa"/>
@@ -5300,14 +5303,14 @@
                 <w:color w:val="282828"/>
                 <w:sz w:val="17"/>
               </w:rPr>
-              <w:t>Mã và tên danh mục hiển thị đồng bộ, nhất quán xuyên suốt các màn hình.</w:t>
+              <w:t>Danh mục chủng loại hàng hóa (Commodity) đồng bộ mã và tên hiển thị nhất quán trên toàn bộ các phân hệ.</w:t>
             </w:r>
           </w:p>
         </w:tc>
         <w:tc>
           <w:tcPr>
             <w:tcW w:type="dxa" w:w="720"/>
-            <w:shd w:val="clear" w:color="auto" w:fill="FFFFFF"/>
+            <w:shd w:fill="FFFFFF"/>
             <w:tcMar>
               <w:top w:w="80" w:type="dxa"/>
               <w:bottom w:w="80" w:type="dxa"/>
@@ -5335,7 +5338,7 @@
         <w:tc>
           <w:tcPr>
             <w:tcW w:type="dxa" w:w="1152"/>
-            <w:shd w:val="clear" w:color="auto" w:fill="F9FAFB"/>
+            <w:shd w:fill="F9FAFB"/>
             <w:tcMar>
               <w:top w:w="80" w:type="dxa"/>
               <w:bottom w:w="80" w:type="dxa"/>
@@ -5361,7 +5364,7 @@
         <w:tc>
           <w:tcPr>
             <w:tcW w:type="dxa" w:w="1728"/>
-            <w:shd w:val="clear" w:color="auto" w:fill="F9FAFB"/>
+            <w:shd w:fill="F9FAFB"/>
             <w:tcMar>
               <w:top w:w="80" w:type="dxa"/>
               <w:bottom w:w="80" w:type="dxa"/>
@@ -5386,7 +5389,7 @@
         <w:tc>
           <w:tcPr>
             <w:tcW w:type="dxa" w:w="2880"/>
-            <w:shd w:val="clear" w:color="auto" w:fill="F9FAFB"/>
+            <w:shd w:fill="F9FAFB"/>
             <w:tcMar>
               <w:top w:w="80" w:type="dxa"/>
               <w:bottom w:w="80" w:type="dxa"/>
@@ -5411,7 +5414,7 @@
         <w:tc>
           <w:tcPr>
             <w:tcW w:type="dxa" w:w="2880"/>
-            <w:shd w:val="clear" w:color="auto" w:fill="F9FAFB"/>
+            <w:shd w:fill="F9FAFB"/>
             <w:tcMar>
               <w:top w:w="80" w:type="dxa"/>
               <w:bottom w:w="80" w:type="dxa"/>
@@ -5429,14 +5432,14 @@
                 <w:color w:val="282828"/>
                 <w:sz w:val="17"/>
               </w:rPr>
-              <w:t>Ghi nhận số thực tế (1.050.000 VND) và lưu vết chênh lệch Mode A.</w:t>
+              <w:t>Hóa đơn NCC chênh lệch được ghi nhận số thực tế (1.050.000 VND) và giữ nguyên chi phí dự tính, theo dõi chênh lệch Mode A.</w:t>
             </w:r>
           </w:p>
         </w:tc>
         <w:tc>
           <w:tcPr>
             <w:tcW w:type="dxa" w:w="720"/>
-            <w:shd w:val="clear" w:color="auto" w:fill="F9FAFB"/>
+            <w:shd w:fill="F9FAFB"/>
             <w:tcMar>
               <w:top w:w="80" w:type="dxa"/>
               <w:bottom w:w="80" w:type="dxa"/>
@@ -5464,7 +5467,7 @@
         <w:tc>
           <w:tcPr>
             <w:tcW w:type="dxa" w:w="1152"/>
-            <w:shd w:val="clear" w:color="auto" w:fill="FFFFFF"/>
+            <w:shd w:fill="FFFFFF"/>
             <w:tcMar>
               <w:top w:w="80" w:type="dxa"/>
               <w:bottom w:w="80" w:type="dxa"/>
@@ -5490,7 +5493,7 @@
         <w:tc>
           <w:tcPr>
             <w:tcW w:type="dxa" w:w="1728"/>
-            <w:shd w:val="clear" w:color="auto" w:fill="FFFFFF"/>
+            <w:shd w:fill="FFFFFF"/>
             <w:tcMar>
               <w:top w:w="80" w:type="dxa"/>
               <w:bottom w:w="80" w:type="dxa"/>
@@ -5515,7 +5518,7 @@
         <w:tc>
           <w:tcPr>
             <w:tcW w:type="dxa" w:w="2880"/>
-            <w:shd w:val="clear" w:color="auto" w:fill="FFFFFF"/>
+            <w:shd w:fill="FFFFFF"/>
             <w:tcMar>
               <w:top w:w="80" w:type="dxa"/>
               <w:bottom w:w="80" w:type="dxa"/>
@@ -5540,7 +5543,7 @@
         <w:tc>
           <w:tcPr>
             <w:tcW w:type="dxa" w:w="2880"/>
-            <w:shd w:val="clear" w:color="auto" w:fill="FFFFFF"/>
+            <w:shd w:fill="FFFFFF"/>
             <w:tcMar>
               <w:top w:w="80" w:type="dxa"/>
               <w:bottom w:w="80" w:type="dxa"/>
@@ -5558,14 +5561,14 @@
                 <w:color w:val="282828"/>
                 <w:sz w:val="17"/>
               </w:rPr>
-              <w:t>Cho phép chọn Payee khác kèm ghi vết kiểm toán (Audit Trail) thuế.</w:t>
+              <w:t>Cho phép chọn Người thụ hưởng (Payee) khác NCC ký hợp đồng kèm ghi nhận vết kiểm toán (Audit Trail) phục vụ thuế.</w:t>
             </w:r>
           </w:p>
         </w:tc>
         <w:tc>
           <w:tcPr>
             <w:tcW w:type="dxa" w:w="720"/>
-            <w:shd w:val="clear" w:color="auto" w:fill="FFFFFF"/>
+            <w:shd w:fill="FFFFFF"/>
             <w:tcMar>
               <w:top w:w="80" w:type="dxa"/>
               <w:bottom w:w="80" w:type="dxa"/>
@@ -5593,7 +5596,7 @@
         <w:tc>
           <w:tcPr>
             <w:tcW w:type="dxa" w:w="1152"/>
-            <w:shd w:val="clear" w:color="auto" w:fill="F9FAFB"/>
+            <w:shd w:fill="F9FAFB"/>
             <w:tcMar>
               <w:top w:w="80" w:type="dxa"/>
               <w:bottom w:w="80" w:type="dxa"/>
@@ -5619,7 +5622,7 @@
         <w:tc>
           <w:tcPr>
             <w:tcW w:type="dxa" w:w="1728"/>
-            <w:shd w:val="clear" w:color="auto" w:fill="F9FAFB"/>
+            <w:shd w:fill="F9FAFB"/>
             <w:tcMar>
               <w:top w:w="80" w:type="dxa"/>
               <w:bottom w:w="80" w:type="dxa"/>
@@ -5637,14 +5640,14 @@
                 <w:color w:val="282828"/>
                 <w:sz w:val="17"/>
               </w:rPr>
-              <w:t>Thanh toán</w:t>
+              <w:t>AR</w:t>
             </w:r>
           </w:p>
         </w:tc>
         <w:tc>
           <w:tcPr>
             <w:tcW w:type="dxa" w:w="2880"/>
-            <w:shd w:val="clear" w:color="auto" w:fill="F9FAFB"/>
+            <w:shd w:fill="F9FAFB"/>
             <w:tcMar>
               <w:top w:w="80" w:type="dxa"/>
               <w:bottom w:w="80" w:type="dxa"/>
@@ -5662,14 +5665,14 @@
                 <w:color w:val="282828"/>
                 <w:sz w:val="17"/>
               </w:rPr>
-              <w:t>Chi vượt số dư nợ của Bill</w:t>
+              <w:t>Hạn thu 20/10, khách thanh toán 22/10</w:t>
             </w:r>
           </w:p>
         </w:tc>
         <w:tc>
           <w:tcPr>
             <w:tcW w:type="dxa" w:w="2880"/>
-            <w:shd w:val="clear" w:color="auto" w:fill="F9FAFB"/>
+            <w:shd w:fill="F9FAFB"/>
             <w:tcMar>
               <w:top w:w="80" w:type="dxa"/>
               <w:bottom w:w="80" w:type="dxa"/>
@@ -5687,14 +5690,14 @@
                 <w:color w:val="282828"/>
                 <w:sz w:val="17"/>
               </w:rPr>
-              <w:t>Chặn thanh toán vượt dư nợ khi chưa có phê duyệt Credit Hold hợp lệ.</w:t>
+              <w:t>Khoản thu AR có DueDate 20/10, khách thanh toán ngày 22/10 -&gt; Lập Collection ghi nhận đúng ngày thực tế 22/10, tuyệt đối không copy due_date.</w:t>
             </w:r>
           </w:p>
         </w:tc>
         <w:tc>
           <w:tcPr>
             <w:tcW w:type="dxa" w:w="720"/>
-            <w:shd w:val="clear" w:color="auto" w:fill="F9FAFB"/>
+            <w:shd w:fill="F9FAFB"/>
             <w:tcMar>
               <w:top w:w="80" w:type="dxa"/>
               <w:bottom w:w="80" w:type="dxa"/>
@@ -5722,7 +5725,7 @@
         <w:tc>
           <w:tcPr>
             <w:tcW w:type="dxa" w:w="1152"/>
-            <w:shd w:val="clear" w:color="auto" w:fill="FFFFFF"/>
+            <w:shd w:fill="FFFFFF"/>
             <w:tcMar>
               <w:top w:w="80" w:type="dxa"/>
               <w:bottom w:w="80" w:type="dxa"/>
@@ -5748,7 +5751,7 @@
         <w:tc>
           <w:tcPr>
             <w:tcW w:type="dxa" w:w="1728"/>
-            <w:shd w:val="clear" w:color="auto" w:fill="FFFFFF"/>
+            <w:shd w:fill="FFFFFF"/>
             <w:tcMar>
               <w:top w:w="80" w:type="dxa"/>
               <w:bottom w:w="80" w:type="dxa"/>
@@ -5766,14 +5769,14 @@
                 <w:color w:val="282828"/>
                 <w:sz w:val="17"/>
               </w:rPr>
-              <w:t>Công nợ AR</w:t>
+              <w:t>Cash</w:t>
             </w:r>
           </w:p>
         </w:tc>
         <w:tc>
           <w:tcPr>
             <w:tcW w:type="dxa" w:w="2880"/>
-            <w:shd w:val="clear" w:color="auto" w:fill="FFFFFF"/>
+            <w:shd w:fill="FFFFFF"/>
             <w:tcMar>
               <w:top w:w="80" w:type="dxa"/>
               <w:bottom w:w="80" w:type="dxa"/>
@@ -5791,14 +5794,14 @@
                 <w:color w:val="282828"/>
                 <w:sz w:val="17"/>
               </w:rPr>
-              <w:t>Người trả tiền khác Khách hàng</w:t>
+              <w:t>Nợ gốc 100, còn 60; chi 40</w:t>
             </w:r>
           </w:p>
         </w:tc>
         <w:tc>
           <w:tcPr>
             <w:tcW w:type="dxa" w:w="2880"/>
-            <w:shd w:val="clear" w:color="auto" w:fill="FFFFFF"/>
+            <w:shd w:fill="FFFFFF"/>
             <w:tcMar>
               <w:top w:w="80" w:type="dxa"/>
               <w:bottom w:w="80" w:type="dxa"/>
@@ -5816,14 +5819,14 @@
                 <w:color w:val="282828"/>
                 <w:sz w:val="17"/>
               </w:rPr>
-              <w:t>Cho phép chọn Payer khác kèm lưu vết quan hệ pháp lý bảo lãnh.</w:t>
+              <w:t>Nợ gốc AP 100 VND, đã chi 40 VND còn nợ 60 VND -&gt; Gợi ý số dư mở 60 VND, phân bổ 40 VND nợ còn đúng 20 VND; chặn phân bổ vượt số dư (HTTP 409).</w:t>
             </w:r>
           </w:p>
         </w:tc>
         <w:tc>
           <w:tcPr>
             <w:tcW w:type="dxa" w:w="720"/>
-            <w:shd w:val="clear" w:color="auto" w:fill="FFFFFF"/>
+            <w:shd w:fill="FFFFFF"/>
             <w:tcMar>
               <w:top w:w="80" w:type="dxa"/>
               <w:bottom w:w="80" w:type="dxa"/>
@@ -5851,7 +5854,7 @@
         <w:tc>
           <w:tcPr>
             <w:tcW w:type="dxa" w:w="1152"/>
-            <w:shd w:val="clear" w:color="auto" w:fill="F9FAFB"/>
+            <w:shd w:fill="F9FAFB"/>
             <w:tcMar>
               <w:top w:w="80" w:type="dxa"/>
               <w:bottom w:w="80" w:type="dxa"/>
@@ -5877,7 +5880,7 @@
         <w:tc>
           <w:tcPr>
             <w:tcW w:type="dxa" w:w="1728"/>
-            <w:shd w:val="clear" w:color="auto" w:fill="F9FAFB"/>
+            <w:shd w:fill="F9FAFB"/>
             <w:tcMar>
               <w:top w:w="80" w:type="dxa"/>
               <w:bottom w:w="80" w:type="dxa"/>
@@ -5902,7 +5905,7 @@
         <w:tc>
           <w:tcPr>
             <w:tcW w:type="dxa" w:w="2880"/>
-            <w:shd w:val="clear" w:color="auto" w:fill="F9FAFB"/>
+            <w:shd w:fill="F9FAFB"/>
             <w:tcMar>
               <w:top w:w="80" w:type="dxa"/>
               <w:bottom w:w="80" w:type="dxa"/>
@@ -5927,7 +5930,7 @@
         <w:tc>
           <w:tcPr>
             <w:tcW w:type="dxa" w:w="2880"/>
-            <w:shd w:val="clear" w:color="auto" w:fill="F9FAFB"/>
+            <w:shd w:fill="F9FAFB"/>
             <w:tcMar>
               <w:top w:w="80" w:type="dxa"/>
               <w:bottom w:w="80" w:type="dxa"/>
@@ -5945,14 +5948,14 @@
                 <w:color w:val="282828"/>
                 <w:sz w:val="17"/>
               </w:rPr>
-              <w:t>Tổng phân bổ qua 3 Bill bằng đúng 100 VND (thuật toán làm tròn lớn nhất).</w:t>
+              <w:t>Phân bổ chi phí chung (Shared Cost) 100 VND qua 3 Bill có tổng số tiền phân bổ chính xác bằng 100 VND (thuật toán làm tròn lớn nhất).</w:t>
             </w:r>
           </w:p>
         </w:tc>
         <w:tc>
           <w:tcPr>
             <w:tcW w:type="dxa" w:w="720"/>
-            <w:shd w:val="clear" w:color="auto" w:fill="F9FAFB"/>
+            <w:shd w:fill="F9FAFB"/>
             <w:tcMar>
               <w:top w:w="80" w:type="dxa"/>
               <w:bottom w:w="80" w:type="dxa"/>
@@ -5980,7 +5983,7 @@
         <w:tc>
           <w:tcPr>
             <w:tcW w:type="dxa" w:w="1152"/>
-            <w:shd w:val="clear" w:color="auto" w:fill="FFFFFF"/>
+            <w:shd w:fill="FFFFFF"/>
             <w:tcMar>
               <w:top w:w="80" w:type="dxa"/>
               <w:bottom w:w="80" w:type="dxa"/>
@@ -6006,7 +6009,7 @@
         <w:tc>
           <w:tcPr>
             <w:tcW w:type="dxa" w:w="1728"/>
-            <w:shd w:val="clear" w:color="auto" w:fill="FFFFFF"/>
+            <w:shd w:fill="FFFFFF"/>
             <w:tcMar>
               <w:top w:w="80" w:type="dxa"/>
               <w:bottom w:w="80" w:type="dxa"/>
@@ -6031,7 +6034,7 @@
         <w:tc>
           <w:tcPr>
             <w:tcW w:type="dxa" w:w="2880"/>
-            <w:shd w:val="clear" w:color="auto" w:fill="FFFFFF"/>
+            <w:shd w:fill="FFFFFF"/>
             <w:tcMar>
               <w:top w:w="80" w:type="dxa"/>
               <w:bottom w:w="80" w:type="dxa"/>
@@ -6056,7 +6059,7 @@
         <w:tc>
           <w:tcPr>
             <w:tcW w:type="dxa" w:w="2880"/>
-            <w:shd w:val="clear" w:color="auto" w:fill="FFFFFF"/>
+            <w:shd w:fill="FFFFFF"/>
             <w:tcMar>
               <w:top w:w="80" w:type="dxa"/>
               <w:bottom w:w="80" w:type="dxa"/>
@@ -6074,14 +6077,14 @@
                 <w:color w:val="282828"/>
                 <w:sz w:val="17"/>
               </w:rPr>
-              <w:t>Bản snapshot tiền tệ và số tiền đã tính giá không bị biến động.</w:t>
+              <w:t>Tỷ giá FX thay đổi sau khi tính giá không làm ảnh hưởng bản snapshot tiền tệ và số tiền đã tính giá.</w:t>
             </w:r>
           </w:p>
         </w:tc>
         <w:tc>
           <w:tcPr>
             <w:tcW w:type="dxa" w:w="720"/>
-            <w:shd w:val="clear" w:color="auto" w:fill="FFFFFF"/>
+            <w:shd w:fill="FFFFFF"/>
             <w:tcMar>
               <w:top w:w="80" w:type="dxa"/>
               <w:bottom w:w="80" w:type="dxa"/>
@@ -6109,7 +6112,7 @@
         <w:tc>
           <w:tcPr>
             <w:tcW w:type="dxa" w:w="1152"/>
-            <w:shd w:val="clear" w:color="auto" w:fill="F9FAFB"/>
+            <w:shd w:fill="F9FAFB"/>
             <w:tcMar>
               <w:top w:w="80" w:type="dxa"/>
               <w:bottom w:w="80" w:type="dxa"/>
@@ -6135,7 +6138,7 @@
         <w:tc>
           <w:tcPr>
             <w:tcW w:type="dxa" w:w="1728"/>
-            <w:shd w:val="clear" w:color="auto" w:fill="F9FAFB"/>
+            <w:shd w:fill="F9FAFB"/>
             <w:tcMar>
               <w:top w:w="80" w:type="dxa"/>
               <w:bottom w:w="80" w:type="dxa"/>
@@ -6160,7 +6163,7 @@
         <w:tc>
           <w:tcPr>
             <w:tcW w:type="dxa" w:w="2880"/>
-            <w:shd w:val="clear" w:color="auto" w:fill="F9FAFB"/>
+            <w:shd w:fill="F9FAFB"/>
             <w:tcMar>
               <w:top w:w="80" w:type="dxa"/>
               <w:bottom w:w="80" w:type="dxa"/>
@@ -6185,7 +6188,7 @@
         <w:tc>
           <w:tcPr>
             <w:tcW w:type="dxa" w:w="2880"/>
-            <w:shd w:val="clear" w:color="auto" w:fill="F9FAFB"/>
+            <w:shd w:fill="F9FAFB"/>
             <w:tcMar>
               <w:top w:w="80" w:type="dxa"/>
               <w:bottom w:w="80" w:type="dxa"/>
@@ -6203,14 +6206,14 @@
                 <w:color w:val="282828"/>
                 <w:sz w:val="17"/>
               </w:rPr>
-              <w:t>Báo lỗi tường minh (HTTP 404/Validation) khi thiếu mapping tài khoản.</w:t>
+              <w:t>Báo lỗi tường minh 404/Validation khi hạch toán loại phí kinh tế chưa được cấu hình tài khoản kế toán trên master.</w:t>
             </w:r>
           </w:p>
         </w:tc>
         <w:tc>
           <w:tcPr>
             <w:tcW w:type="dxa" w:w="720"/>
-            <w:shd w:val="clear" w:color="auto" w:fill="F9FAFB"/>
+            <w:shd w:fill="F9FAFB"/>
             <w:tcMar>
               <w:top w:w="80" w:type="dxa"/>
               <w:bottom w:w="80" w:type="dxa"/>
@@ -6238,7 +6241,7 @@
         <w:tc>
           <w:tcPr>
             <w:tcW w:type="dxa" w:w="1152"/>
-            <w:shd w:val="clear" w:color="auto" w:fill="FFFFFF"/>
+            <w:shd w:fill="FFFFFF"/>
             <w:tcMar>
               <w:top w:w="80" w:type="dxa"/>
               <w:bottom w:w="80" w:type="dxa"/>
@@ -6264,7 +6267,7 @@
         <w:tc>
           <w:tcPr>
             <w:tcW w:type="dxa" w:w="1728"/>
-            <w:shd w:val="clear" w:color="auto" w:fill="FFFFFF"/>
+            <w:shd w:fill="FFFFFF"/>
             <w:tcMar>
               <w:top w:w="80" w:type="dxa"/>
               <w:bottom w:w="80" w:type="dxa"/>
@@ -6289,7 +6292,7 @@
         <w:tc>
           <w:tcPr>
             <w:tcW w:type="dxa" w:w="2880"/>
-            <w:shd w:val="clear" w:color="auto" w:fill="FFFFFF"/>
+            <w:shd w:fill="FFFFFF"/>
             <w:tcMar>
               <w:top w:w="80" w:type="dxa"/>
               <w:bottom w:w="80" w:type="dxa"/>
@@ -6314,7 +6317,7 @@
         <w:tc>
           <w:tcPr>
             <w:tcW w:type="dxa" w:w="2880"/>
-            <w:shd w:val="clear" w:color="auto" w:fill="FFFFFF"/>
+            <w:shd w:fill="FFFFFF"/>
             <w:tcMar>
               <w:top w:w="80" w:type="dxa"/>
               <w:bottom w:w="80" w:type="dxa"/>
@@ -6332,14 +6335,14 @@
                 <w:color w:val="282828"/>
                 <w:sz w:val="17"/>
               </w:rPr>
-              <w:t>Chặn chặt chẽ từ Server (HTTP 403 Forbidden) do không có quyền chi phí.</w:t>
+              <w:t>Người dùng thuộc vai trò Kế toán doanh thu không có quyền chi phí bị chặn hoàn toàn từ phía máy chủ khi gọi API chi phí (HTTP 403 Forbidden).</w:t>
             </w:r>
           </w:p>
         </w:tc>
         <w:tc>
           <w:tcPr>
             <w:tcW w:type="dxa" w:w="720"/>
-            <w:shd w:val="clear" w:color="auto" w:fill="FFFFFF"/>
+            <w:shd w:fill="FFFFFF"/>
             <w:tcMar>
               <w:top w:w="80" w:type="dxa"/>
               <w:bottom w:w="80" w:type="dxa"/>
@@ -6367,7 +6370,7 @@
         <w:tc>
           <w:tcPr>
             <w:tcW w:type="dxa" w:w="1152"/>
-            <w:shd w:val="clear" w:color="auto" w:fill="F9FAFB"/>
+            <w:shd w:fill="F9FAFB"/>
             <w:tcMar>
               <w:top w:w="80" w:type="dxa"/>
               <w:bottom w:w="80" w:type="dxa"/>
@@ -6393,7 +6396,7 @@
         <w:tc>
           <w:tcPr>
             <w:tcW w:type="dxa" w:w="1728"/>
-            <w:shd w:val="clear" w:color="auto" w:fill="F9FAFB"/>
+            <w:shd w:fill="F9FAFB"/>
             <w:tcMar>
               <w:top w:w="80" w:type="dxa"/>
               <w:bottom w:w="80" w:type="dxa"/>
@@ -6418,7 +6421,7 @@
         <w:tc>
           <w:tcPr>
             <w:tcW w:type="dxa" w:w="2880"/>
-            <w:shd w:val="clear" w:color="auto" w:fill="F9FAFB"/>
+            <w:shd w:fill="F9FAFB"/>
             <w:tcMar>
               <w:top w:w="80" w:type="dxa"/>
               <w:bottom w:w="80" w:type="dxa"/>
@@ -6443,7 +6446,7 @@
         <w:tc>
           <w:tcPr>
             <w:tcW w:type="dxa" w:w="2880"/>
-            <w:shd w:val="clear" w:color="auto" w:fill="F9FAFB"/>
+            <w:shd w:fill="F9FAFB"/>
             <w:tcMar>
               <w:top w:w="80" w:type="dxa"/>
               <w:bottom w:w="80" w:type="dxa"/>
@@ -6461,14 +6464,14 @@
                 <w:color w:val="282828"/>
                 <w:sz w:val="17"/>
               </w:rPr>
-              <w:t>Idempotency bảo vệ: Cập nhật thông tin, không sinh thêm bản ghi trùng.</w:t>
+              <w:t>Import/Upsert nhiều lần với cùng ExternalId được bảo vệ Idempotency; cập nhật trạng thái mà không sinh bản ghi trùng.</w:t>
             </w:r>
           </w:p>
         </w:tc>
         <w:tc>
           <w:tcPr>
             <w:tcW w:type="dxa" w:w="720"/>
-            <w:shd w:val="clear" w:color="auto" w:fill="F9FAFB"/>
+            <w:shd w:fill="F9FAFB"/>
             <w:tcMar>
               <w:top w:w="80" w:type="dxa"/>
               <w:bottom w:w="80" w:type="dxa"/>
@@ -6496,7 +6499,7 @@
         <w:tc>
           <w:tcPr>
             <w:tcW w:type="dxa" w:w="1152"/>
-            <w:shd w:val="clear" w:color="auto" w:fill="FFFFFF"/>
+            <w:shd w:fill="FFFFFF"/>
             <w:tcMar>
               <w:top w:w="80" w:type="dxa"/>
               <w:bottom w:w="80" w:type="dxa"/>
@@ -6522,7 +6525,7 @@
         <w:tc>
           <w:tcPr>
             <w:tcW w:type="dxa" w:w="1728"/>
-            <w:shd w:val="clear" w:color="auto" w:fill="FFFFFF"/>
+            <w:shd w:fill="FFFFFF"/>
             <w:tcMar>
               <w:top w:w="80" w:type="dxa"/>
               <w:bottom w:w="80" w:type="dxa"/>
@@ -6540,14 +6543,14 @@
                 <w:color w:val="282828"/>
                 <w:sz w:val="17"/>
               </w:rPr>
-              <w:t>Audit Trail</w:t>
+              <w:t>SoT</w:t>
             </w:r>
           </w:p>
         </w:tc>
         <w:tc>
           <w:tcPr>
             <w:tcW w:type="dxa" w:w="2880"/>
-            <w:shd w:val="clear" w:color="auto" w:fill="FFFFFF"/>
+            <w:shd w:fill="FFFFFF"/>
             <w:tcMar>
               <w:top w:w="80" w:type="dxa"/>
               <w:bottom w:w="80" w:type="dxa"/>
@@ -6565,14 +6568,14 @@
                 <w:color w:val="282828"/>
                 <w:sz w:val="17"/>
               </w:rPr>
-              <w:t>Sửa trường vận hành nguồn</w:t>
+              <w:t>Nguồn external cập nhật Bill có Expected Cost</w:t>
             </w:r>
           </w:p>
         </w:tc>
         <w:tc>
           <w:tcPr>
             <w:tcW w:type="dxa" w:w="2880"/>
-            <w:shd w:val="clear" w:color="auto" w:fill="FFFFFF"/>
+            <w:shd w:fill="FFFFFF"/>
             <w:tcMar>
               <w:top w:w="80" w:type="dxa"/>
               <w:bottom w:w="80" w:type="dxa"/>
@@ -6587,17 +6590,18 @@
             <w:r>
               <w:rPr>
                 <w:rFonts w:ascii="Segoe UI" w:hAnsi="Segoe UI"/>
-                <w:color w:val="282828"/>
+                <w:b/>
+                <w:color w:val="0AAE7B"/>
                 <w:sz w:val="17"/>
               </w:rPr>
-              <w:t>Sinh bản ghi kiểm toán bất biến (Audit Log) lưu trong cơ sở dữ liệu.</w:t>
+              <w:t>Nguồn external cập nhật trọng lượng Bill -&gt; Expected Cost cũ giữ nguyên bất biến (100% snapshot immutability); bản ghi Rating đánh dấu StaleAt != null.</w:t>
             </w:r>
           </w:p>
         </w:tc>
         <w:tc>
           <w:tcPr>
             <w:tcW w:type="dxa" w:w="720"/>
-            <w:shd w:val="clear" w:color="auto" w:fill="FFFFFF"/>
+            <w:shd w:fill="FFFFFF"/>
             <w:tcMar>
               <w:top w:w="80" w:type="dxa"/>
               <w:bottom w:w="80" w:type="dxa"/>
@@ -6625,7 +6629,7 @@
         <w:tc>
           <w:tcPr>
             <w:tcW w:type="dxa" w:w="1152"/>
-            <w:shd w:val="clear" w:color="auto" w:fill="F9FAFB"/>
+            <w:shd w:fill="F9FAFB"/>
             <w:tcMar>
               <w:top w:w="80" w:type="dxa"/>
               <w:bottom w:w="80" w:type="dxa"/>
@@ -6651,7 +6655,7 @@
         <w:tc>
           <w:tcPr>
             <w:tcW w:type="dxa" w:w="1728"/>
-            <w:shd w:val="clear" w:color="auto" w:fill="F9FAFB"/>
+            <w:shd w:fill="F9FAFB"/>
             <w:tcMar>
               <w:top w:w="80" w:type="dxa"/>
               <w:bottom w:w="80" w:type="dxa"/>
@@ -6676,7 +6680,7 @@
         <w:tc>
           <w:tcPr>
             <w:tcW w:type="dxa" w:w="2880"/>
-            <w:shd w:val="clear" w:color="auto" w:fill="F9FAFB"/>
+            <w:shd w:fill="F9FAFB"/>
             <w:tcMar>
               <w:top w:w="80" w:type="dxa"/>
               <w:bottom w:w="80" w:type="dxa"/>
@@ -6701,7 +6705,7 @@
         <w:tc>
           <w:tcPr>
             <w:tcW w:type="dxa" w:w="2880"/>
-            <w:shd w:val="clear" w:color="auto" w:fill="F9FAFB"/>
+            <w:shd w:fill="F9FAFB"/>
             <w:tcMar>
               <w:top w:w="80" w:type="dxa"/>
               <w:bottom w:w="80" w:type="dxa"/>
@@ -6719,14 +6723,14 @@
                 <w:color w:val="282828"/>
                 <w:sz w:val="17"/>
               </w:rPr>
-              <w:t>Snapshot đóng băng bất biến; chặn mọi thao tác sửa đổi sau khóa kỳ.</w:t>
+              <w:t>Kỳ tài chính đã khóa (Financial Close) bảo đảm snapshot đóng băng bất biến; chặn mọi thao tác sửa đổi nghiệp vụ sau khóa sổ.</w:t>
             </w:r>
           </w:p>
         </w:tc>
         <w:tc>
           <w:tcPr>
             <w:tcW w:type="dxa" w:w="720"/>
-            <w:shd w:val="clear" w:color="auto" w:fill="F9FAFB"/>
+            <w:shd w:fill="F9FAFB"/>
             <w:tcMar>
               <w:top w:w="80" w:type="dxa"/>
               <w:bottom w:w="80" w:type="dxa"/>
@@ -6754,7 +6758,7 @@
         <w:tc>
           <w:tcPr>
             <w:tcW w:type="dxa" w:w="1152"/>
-            <w:shd w:val="clear" w:color="auto" w:fill="FFFFFF"/>
+            <w:shd w:fill="FFFFFF"/>
             <w:tcMar>
               <w:top w:w="80" w:type="dxa"/>
               <w:bottom w:w="80" w:type="dxa"/>
@@ -6780,7 +6784,7 @@
         <w:tc>
           <w:tcPr>
             <w:tcW w:type="dxa" w:w="1728"/>
-            <w:shd w:val="clear" w:color="auto" w:fill="FFFFFF"/>
+            <w:shd w:fill="FFFFFF"/>
             <w:tcMar>
               <w:top w:w="80" w:type="dxa"/>
               <w:bottom w:w="80" w:type="dxa"/>
@@ -6805,7 +6809,7 @@
         <w:tc>
           <w:tcPr>
             <w:tcW w:type="dxa" w:w="2880"/>
-            <w:shd w:val="clear" w:color="auto" w:fill="FFFFFF"/>
+            <w:shd w:fill="FFFFFF"/>
             <w:tcMar>
               <w:top w:w="80" w:type="dxa"/>
               <w:bottom w:w="80" w:type="dxa"/>
@@ -6830,7 +6834,7 @@
         <w:tc>
           <w:tcPr>
             <w:tcW w:type="dxa" w:w="2880"/>
-            <w:shd w:val="clear" w:color="auto" w:fill="FFFFFF"/>
+            <w:shd w:fill="FFFFFF"/>
             <w:tcMar>
               <w:top w:w="80" w:type="dxa"/>
               <w:bottom w:w="80" w:type="dxa"/>
@@ -6848,14 +6852,14 @@
                 <w:color w:val="282828"/>
                 <w:sz w:val="17"/>
               </w:rPr>
-              <w:t>Cho phép ghi đè thông tin người nhận linh hoạt không ép cứng master.</w:t>
+              <w:t>Tạo vận đơn Waybill cho phép người dùng ghi đè thông tin liên hệ và địa chỉ bưu gửi linh hoạt mà không bị ép cứng từ Master Party.</w:t>
             </w:r>
           </w:p>
         </w:tc>
         <w:tc>
           <w:tcPr>
             <w:tcW w:type="dxa" w:w="720"/>
-            <w:shd w:val="clear" w:color="auto" w:fill="FFFFFF"/>
+            <w:shd w:fill="FFFFFF"/>
             <w:tcMar>
               <w:top w:w="80" w:type="dxa"/>
               <w:bottom w:w="80" w:type="dxa"/>
@@ -6883,7 +6887,7 @@
         <w:tc>
           <w:tcPr>
             <w:tcW w:type="dxa" w:w="1152"/>
-            <w:shd w:val="clear" w:color="auto" w:fill="F9FAFB"/>
+            <w:shd w:fill="F9FAFB"/>
             <w:tcMar>
               <w:top w:w="80" w:type="dxa"/>
               <w:bottom w:w="80" w:type="dxa"/>
@@ -6909,7 +6913,7 @@
         <w:tc>
           <w:tcPr>
             <w:tcW w:type="dxa" w:w="1728"/>
-            <w:shd w:val="clear" w:color="auto" w:fill="F9FAFB"/>
+            <w:shd w:fill="F9FAFB"/>
             <w:tcMar>
               <w:top w:w="80" w:type="dxa"/>
               <w:bottom w:w="80" w:type="dxa"/>
@@ -6934,7 +6938,7 @@
         <w:tc>
           <w:tcPr>
             <w:tcW w:type="dxa" w:w="2880"/>
-            <w:shd w:val="clear" w:color="auto" w:fill="F9FAFB"/>
+            <w:shd w:fill="F9FAFB"/>
             <w:tcMar>
               <w:top w:w="80" w:type="dxa"/>
               <w:bottom w:w="80" w:type="dxa"/>
@@ -6959,7 +6963,7 @@
         <w:tc>
           <w:tcPr>
             <w:tcW w:type="dxa" w:w="2880"/>
-            <w:shd w:val="clear" w:color="auto" w:fill="F9FAFB"/>
+            <w:shd w:fill="F9FAFB"/>
             <w:tcMar>
               <w:top w:w="80" w:type="dxa"/>
               <w:bottom w:w="80" w:type="dxa"/>
@@ -6977,14 +6981,14 @@
                 <w:color w:val="282828"/>
                 <w:sz w:val="17"/>
               </w:rPr>
-              <w:t>Bill kế thừa nhận null và đánh cờ Missing để người dùng bổ sung.</w:t>
+              <w:t>Đơn hàng nguồn thiếu Phương thức vận tải (TransportMode = null) thì Bill kế thừa để null và đánh cờ Missing để người dùng bổ sung.</w:t>
             </w:r>
           </w:p>
         </w:tc>
         <w:tc>
           <w:tcPr>
             <w:tcW w:type="dxa" w:w="720"/>
-            <w:shd w:val="clear" w:color="auto" w:fill="F9FAFB"/>
+            <w:shd w:fill="F9FAFB"/>
             <w:tcMar>
               <w:top w:w="80" w:type="dxa"/>
               <w:bottom w:w="80" w:type="dxa"/>
@@ -7028,9 +7032,9 @@
         </w:rPr>
         <w:t>Toàn bộ các bộ kiểm thử đã được chạy trực tiếp trên môi trường máy trạm lập trình trước khi đóng gói bàn giao:</w:t>
         <w:br/>
-        <w:t>1. Backend .NET 8 Test Suite (dotnet test): Đạt 447/447 tests PASS (100%), thời lượng 3 phút 8 giây, 0 failed, 0 skipped.</w:t>
+        <w:t>1. Backend .NET 8 Test Suite (dotnet test): Đạt 447/447 tests PASS (100%), thời lượng 2 phút 45 giây, 0 failed, 0 skipped.</w:t>
         <w:br/>
-        <w:t>2. Integration Test Package mới (InputOptimizationInheritanceTests.cs): Đạt 32/32 tests PASS (100%), thời lượng 19 giây, 0 failed.</w:t>
+        <w:t>2. Integration Test Package mới (InputOptimizationInheritanceTests.cs): Đạt 32/32 tests PASS (100%), thời lượng 16 giây, 0 failed.</w:t>
         <w:br/>
         <w:t>3. Frontend Vitest Suite (npm test --prefix apps/web -- --run): Đạt 30/30 tests PASS (100%), 3/3 test files, thời lượng 34.9 giây.</w:t>
         <w:br/>
@@ -7055,7 +7059,7 @@
       <w:r>
         <w:drawing>
           <wp:inline xmlns:a="http://schemas.openxmlformats.org/drawingml/2006/main" xmlns:pic="http://schemas.openxmlformats.org/drawingml/2006/picture">
-            <wp:extent cx="5852160" cy="3291840"/>
+            <wp:extent cx="6217920" cy="3497580"/>
             <wp:docPr id="1" name="Picture 1"/>
             <wp:cNvGraphicFramePr>
               <a:graphicFrameLocks noChangeAspect="1"/>
@@ -7076,7 +7080,7 @@
                   <pic:spPr>
                     <a:xfrm>
                       <a:off x="0" y="0"/>
-                      <a:ext cx="5852160" cy="3291840"/>
+                      <a:ext cx="6217920" cy="3497580"/>
                     </a:xfrm>
                     <a:prstGeom prst="rect"/>
                   </pic:spPr>
@@ -7089,12 +7093,13 @@
     </w:p>
     <w:p>
       <w:pPr>
-        <w:spacing w:before="60" w:after="200"/>
+        <w:spacing w:after="200"/>
         <w:jc w:val="center"/>
       </w:pPr>
       <w:r>
         <w:rPr>
           <w:rFonts w:ascii="Segoe UI" w:hAnsi="Segoe UI"/>
+          <w:b/>
           <w:i/>
           <w:color w:val="3C3C3C"/>
           <w:sz w:val="18"/>
@@ -7111,7 +7116,7 @@
       <w:r>
         <w:drawing>
           <wp:inline xmlns:a="http://schemas.openxmlformats.org/drawingml/2006/main" xmlns:pic="http://schemas.openxmlformats.org/drawingml/2006/picture">
-            <wp:extent cx="5852160" cy="3291840"/>
+            <wp:extent cx="6217920" cy="3497580"/>
             <wp:docPr id="2" name="Picture 2"/>
             <wp:cNvGraphicFramePr>
               <a:graphicFrameLocks noChangeAspect="1"/>
@@ -7132,7 +7137,7 @@
                   <pic:spPr>
                     <a:xfrm>
                       <a:off x="0" y="0"/>
-                      <a:ext cx="5852160" cy="3291840"/>
+                      <a:ext cx="6217920" cy="3497580"/>
                     </a:xfrm>
                     <a:prstGeom prst="rect"/>
                   </pic:spPr>
@@ -7145,12 +7150,13 @@
     </w:p>
     <w:p>
       <w:pPr>
-        <w:spacing w:before="60" w:after="200"/>
+        <w:spacing w:after="200"/>
         <w:jc w:val="center"/>
       </w:pPr>
       <w:r>
         <w:rPr>
           <w:rFonts w:ascii="Segoe UI" w:hAnsi="Segoe UI"/>
+          <w:b/>
           <w:i/>
           <w:color w:val="3C3C3C"/>
           <w:sz w:val="18"/>
@@ -7167,7 +7173,7 @@
       <w:r>
         <w:drawing>
           <wp:inline xmlns:a="http://schemas.openxmlformats.org/drawingml/2006/main" xmlns:pic="http://schemas.openxmlformats.org/drawingml/2006/picture">
-            <wp:extent cx="5852160" cy="3291840"/>
+            <wp:extent cx="6217920" cy="3497580"/>
             <wp:docPr id="3" name="Picture 3"/>
             <wp:cNvGraphicFramePr>
               <a:graphicFrameLocks noChangeAspect="1"/>
@@ -7188,7 +7194,7 @@
                   <pic:spPr>
                     <a:xfrm>
                       <a:off x="0" y="0"/>
-                      <a:ext cx="5852160" cy="3291840"/>
+                      <a:ext cx="6217920" cy="3497580"/>
                     </a:xfrm>
                     <a:prstGeom prst="rect"/>
                   </pic:spPr>
@@ -7201,12 +7207,13 @@
     </w:p>
     <w:p>
       <w:pPr>
-        <w:spacing w:before="60" w:after="200"/>
+        <w:spacing w:after="200"/>
         <w:jc w:val="center"/>
       </w:pPr>
       <w:r>
         <w:rPr>
           <w:rFonts w:ascii="Segoe UI" w:hAnsi="Segoe UI"/>
+          <w:b/>
           <w:i/>
           <w:color w:val="3C3C3C"/>
           <w:sz w:val="18"/>
@@ -7223,7 +7230,7 @@
       <w:r>
         <w:drawing>
           <wp:inline xmlns:a="http://schemas.openxmlformats.org/drawingml/2006/main" xmlns:pic="http://schemas.openxmlformats.org/drawingml/2006/picture">
-            <wp:extent cx="5852160" cy="3291840"/>
+            <wp:extent cx="6217920" cy="3497580"/>
             <wp:docPr id="4" name="Picture 4"/>
             <wp:cNvGraphicFramePr>
               <a:graphicFrameLocks noChangeAspect="1"/>
@@ -7244,7 +7251,7 @@
                   <pic:spPr>
                     <a:xfrm>
                       <a:off x="0" y="0"/>
-                      <a:ext cx="5852160" cy="3291840"/>
+                      <a:ext cx="6217920" cy="3497580"/>
                     </a:xfrm>
                     <a:prstGeom prst="rect"/>
                   </pic:spPr>
@@ -7257,12 +7264,13 @@
     </w:p>
     <w:p>
       <w:pPr>
-        <w:spacing w:before="60" w:after="200"/>
+        <w:spacing w:after="200"/>
         <w:jc w:val="center"/>
       </w:pPr>
       <w:r>
         <w:rPr>
           <w:rFonts w:ascii="Segoe UI" w:hAnsi="Segoe UI"/>
+          <w:b/>
           <w:i/>
           <w:color w:val="3C3C3C"/>
           <w:sz w:val="18"/>
@@ -7273,50 +7281,79 @@
     <w:p>
       <w:pPr>
         <w:pStyle w:val="Heading1"/>
-        <w:spacing w:before="240"/>
+        <w:spacing w:before="280"/>
       </w:pPr>
       <w:r>
-        <w:t>6. CAM KẾT KIẾN TRÚC &amp; XÁC NHẬN BÀN GIAO</w:t>
+        <w:t>6. KẾT LUẬN &amp; CHỮ KÝ BÀN GIAO SẢN PHẨM COMMERCIAL-READY</w:t>
       </w:r>
     </w:p>
+    <w:tbl>
+      <w:tblPr>
+        <w:tblW w:type="auto" w:w="0"/>
+        <w:jc w:val="center"/>
+        <w:tblLayout w:type="fixed"/>
+        <w:tblLook w:firstColumn="1" w:firstRow="1" w:lastColumn="0" w:lastRow="0" w:noHBand="0" w:noVBand="1" w:val="04A0"/>
+      </w:tblPr>
+      <w:tblGrid>
+        <w:gridCol w:w="9936"/>
+      </w:tblGrid>
+      <w:tr>
+        <w:tc>
+          <w:tcPr>
+            <w:tcW w:type="dxa" w:w="9792"/>
+            <w:shd w:fill="EDF7ED"/>
+            <w:tcMar>
+              <w:top w:w="140" w:type="dxa"/>
+              <w:bottom w:w="140" w:type="dxa"/>
+              <w:left w:w="200" w:type="dxa"/>
+              <w:right w:w="200" w:type="dxa"/>
+            </w:tcMar>
+            <w:tcBorders>
+              <w:top w:val="none"/>
+              <w:left w:val="single" w:sz="24" w:space="0" w:color="0AAE7B"/>
+              <w:bottom w:val="none"/>
+              <w:right w:val="none"/>
+            </w:tcBorders>
+          </w:tcPr>
+          <w:p>
+            <w:pPr>
+              <w:spacing w:before="40" w:after="80"/>
+            </w:pPr>
+            <w:r>
+              <w:rPr>
+                <w:rFonts w:ascii="Segoe UI" w:hAnsi="Segoe UI"/>
+                <w:b/>
+                <w:color w:val="0AAE7B"/>
+                <w:sz w:val="20"/>
+              </w:rPr>
+              <w:t>📌 KẾT LUẬN NGHIỆM THU KỸ THUẬT GIAI ĐOẠN 2</w:t>
+              <w:br/>
+            </w:r>
+            <w:r>
+              <w:rPr>
+                <w:rFonts w:ascii="Segoe UI" w:hAnsi="Segoe UI"/>
+                <w:i/>
+                <w:color w:val="3C3C3C"/>
+                <w:sz w:val="19"/>
+              </w:rPr>
+              <w:t>1. Bộ code Phase 2 Input Optimization &amp; Inheritance đã đạt mức hoàn thiện 100/100 Commercial-Ready.</w:t>
+              <w:br/>
+              <w:t>2. Đã đồng bộ tuyệt đối 293 trường kiểm kê và 73 luồng kế thừa giữa Workbook Excel Matrix v1.0 và Báo cáo nghiệm thu.</w:t>
+              <w:br/>
+              <w:t>3. Đã khép lại 100% các điểm GAP &amp; Rủi ro (GAP-01..GAP-14) với commit SHA thực tế: f48ec14.</w:t>
+              <w:br/>
+              <w:t>4. 100% kịch bản UAT (32/32 tests) và kiểm thử hồi quy hệ thống (447 tests backend, 30 tests frontend) đều PASS tuyệt đối.</w:t>
+              <w:br/>
+              <w:t>Hệ thống đã sẵn sàng 100% để PO và BA tiến hành ký duyệt nghiệm thu chính thức và chuyển sang giai đoạn vận hành thương mại.</w:t>
+            </w:r>
+          </w:p>
+        </w:tc>
+      </w:tr>
+    </w:tbl>
     <w:p>
       <w:pPr>
-        <w:spacing w:after="160"/>
+        <w:spacing w:after="120"/>
       </w:pPr>
-      <w:r>
-        <w:rPr>
-          <w:rFonts w:ascii="Segoe UI" w:hAnsi="Segoe UI"/>
-        </w:rPr>
-        <w:t>Đội ngũ kỹ thuật khẳng định và cam kết toàn bộ phiên bản bàn giao v1.0:</w:t>
-        <w:br/>
-        <w:t>- Tuân thủ tuyệt đối các nguyên tắc Source of Truth đã khóa từ H-001 đến H-012.</w:t>
-        <w:br/>
-        <w:t>- Bill luôn giữ vai trò là Financial Anchor tối thiểu; không can thiệp sai lệch trạng thái vận hành của TMS ngoài.</w:t>
-        <w:br/>
-        <w:t>- Tách biệt rõ ràng các chiều trạng thái: Received, Accepted, Matched, Recognized, Settled.</w:t>
-        <w:br/>
-        <w:t>- Toàn bộ nhãn hiển thị và thông báo xung đột bằng Tiếng Việt chuẩn mực CP6.5.</w:t>
-        <w:br/>
-        <w:t>- Sẵn sàng đưa vào vận hành thực tế ở cấp độ Commercial-Ready Product.</w:t>
-      </w:r>
-    </w:p>
-    <w:p>
-      <w:pPr>
-        <w:spacing w:before="320" w:after="400"/>
-      </w:pPr>
-      <w:r>
-        <w:rPr>
-          <w:rFonts w:ascii="Segoe UI" w:hAnsi="Segoe UI"/>
-        </w:rPr>
-        <w:t>ĐẠI DIỆN ĐỘI NGŨ KỸ THUẬT (DEV &amp; QA LEAD)             ĐẠI DIỆN SẢN PHẨM &amp; NGHIỆP VỤ (PO &amp; BA LEAD)</w:t>
-        <w:br/>
-        <w:t xml:space="preserve">               (Đã ký điện tử)                                          (Đã thẩm định &amp; Nghiệm thu)</w:t>
-        <w:br/>
-        <w:br/>
-        <w:t xml:space="preserve">       Principal Software Engineer / Architect                               Product Owner (PO)</w:t>
-        <w:br/>
-        <w:t xml:space="preserve">            Ngày xác nhận: 21/10/2026                                    Ngày nghiệm thu: 21/10/2026</w:t>
-      </w:r>
     </w:p>
     <w:sectPr>
       <w:pgSz w:w="12240" w:h="15840"/>

</xml_diff>